<commit_message>
Two-Year History card: Woods's revised document, Edited Summary label
Co-Authored-By: Claude Fable 5 <noreply@anthropic.com>
</commit_message>
<xml_diff>
--- a/files/SFUMC_Misc_TwoYearHistory_2026.docx
+++ b/files/SFUMC_Misc_TwoYearHistory_2026.docx
@@ -1,6 +1,6 @@
 
 <file path=word/document.xml><?xml version="1.0" encoding="utf-8"?>
-<w:document xmlns:wpc="http://schemas.microsoft.com/office/word/2010/wordprocessingCanvas" xmlns:cx="http://schemas.microsoft.com/office/drawing/2014/chartex" xmlns:cx1="http://schemas.microsoft.com/office/drawing/2015/9/8/chartex" xmlns:cx2="http://schemas.microsoft.com/office/drawing/2015/10/21/chartex" xmlns:cx3="http://schemas.microsoft.com/office/drawing/2016/5/9/chartex" xmlns:cx4="http://schemas.microsoft.com/office/drawing/2016/5/10/chartex" xmlns:cx5="http://schemas.microsoft.com/office/drawing/2016/5/11/chartex" xmlns:cx6="http://schemas.microsoft.com/office/drawing/2016/5/12/chartex" xmlns:cx7="http://schemas.microsoft.com/office/drawing/2016/5/13/chartex" xmlns:cx8="http://schemas.microsoft.com/office/drawing/2016/5/14/chartex" xmlns:mc="http://schemas.openxmlformats.org/markup-compatibility/2006" xmlns:aink="http://schemas.microsoft.com/office/drawing/2016/ink" xmlns:am3d="http://schemas.microsoft.com/office/drawing/2017/model3d" xmlns:o="urn:schemas-microsoft-com:office:office" xmlns:oel="http://schemas.microsoft.com/office/2019/extlst" xmlns:r="http://schemas.openxmlformats.org/officeDocument/2006/relationships" xmlns:m="http://schemas.openxmlformats.org/officeDocument/2006/math" xmlns:v="urn:schemas-microsoft-com:vml" xmlns:wp14="http://schemas.microsoft.com/office/word/2010/wordprocessingDrawing" xmlns:wp="http://schemas.openxmlformats.org/drawingml/2006/wordprocessingDrawing" xmlns:w10="urn:schemas-microsoft-com:office:word" xmlns:w="http://schemas.openxmlformats.org/wordprocessingml/2006/main" xmlns:w14="http://schemas.microsoft.com/office/word/2010/wordml" xmlns:w15="http://schemas.microsoft.com/office/word/2012/wordml" xmlns:w16cex="http://schemas.microsoft.com/office/word/2018/wordml/cex" xmlns:w16cid="http://schemas.microsoft.com/office/word/2016/wordml/cid" xmlns:w16="http://schemas.microsoft.com/office/word/2018/wordml" xmlns:w16du="http://schemas.microsoft.com/office/word/2023/wordml/word16du" xmlns:w16sdtdh="http://schemas.microsoft.com/office/word/2020/wordml/sdtdatahash" xmlns:w16sdtfl="http://schemas.microsoft.com/office/word/2024/wordml/sdtformatlock" xmlns:w16se="http://schemas.microsoft.com/office/word/2015/wordml/symex" xmlns:wpg="http://schemas.microsoft.com/office/word/2010/wordprocessingGroup" xmlns:wpi="http://schemas.microsoft.com/office/word/2010/wordprocessingInk" xmlns:wne="http://schemas.microsoft.com/office/word/2006/wordml" xmlns:wps="http://schemas.microsoft.com/office/word/2010/wordprocessingShape" mc:Ignorable="w14 w15 w16se w16cid w16 w16cex w16sdtdh w16sdtfl w16du wp14">
+<w:document xmlns:wpc="http://schemas.microsoft.com/office/word/2010/wordprocessingCanvas" xmlns:cx="http://schemas.microsoft.com/office/drawing/2014/chartex" xmlns:cx1="http://schemas.microsoft.com/office/drawing/2015/9/8/chartex" xmlns:cx2="http://schemas.microsoft.com/office/drawing/2015/10/21/chartex" xmlns:cx3="http://schemas.microsoft.com/office/drawing/2016/5/9/chartex" xmlns:cx4="http://schemas.microsoft.com/office/drawing/2016/5/10/chartex" xmlns:cx5="http://schemas.microsoft.com/office/drawing/2016/5/11/chartex" xmlns:cx6="http://schemas.microsoft.com/office/drawing/2016/5/12/chartex" xmlns:cx7="http://schemas.microsoft.com/office/drawing/2016/5/13/chartex" xmlns:cx8="http://schemas.microsoft.com/office/drawing/2016/5/14/chartex" xmlns:mc="http://schemas.openxmlformats.org/markup-compatibility/2006" xmlns:m="http://schemas.openxmlformats.org/officeDocument/2006/math" xmlns:aink="http://schemas.microsoft.com/office/drawing/2016/ink" xmlns:am3d="http://schemas.microsoft.com/office/drawing/2017/model3d" xmlns:oel="http://schemas.microsoft.com/office/2019/extlst" xmlns:r="http://schemas.openxmlformats.org/officeDocument/2006/relationships" xmlns:wp14="http://schemas.microsoft.com/office/word/2010/wordprocessingDrawing" xmlns:wp="http://schemas.openxmlformats.org/drawingml/2006/wordprocessingDrawing" xmlns:wpg="http://schemas.microsoft.com/office/word/2010/wordprocessingGroup" xmlns:wpi="http://schemas.microsoft.com/office/word/2010/wordprocessingInk" xmlns:wps="http://schemas.microsoft.com/office/word/2010/wordprocessingShape" xmlns:o="urn:schemas-microsoft-com:office:office" xmlns:v="urn:schemas-microsoft-com:vml" xmlns:w10="urn:schemas-microsoft-com:office:word" xmlns:w="http://schemas.openxmlformats.org/wordprocessingml/2006/main" xmlns:w14="http://schemas.microsoft.com/office/word/2010/wordml" xmlns:w15="http://schemas.microsoft.com/office/word/2012/wordml" xmlns:w16cei="http://schemas.microsoft.com/office/word/2026/wordml/cei" xmlns:w16cex="http://schemas.microsoft.com/office/word/2018/wordml/cex" xmlns:w16cid="http://schemas.microsoft.com/office/word/2016/wordml/cid" xmlns:w16="http://schemas.microsoft.com/office/word/2018/wordml" xmlns:w16sdtdh="http://schemas.microsoft.com/office/word/2020/wordml/sdtdatahash" xmlns:w16sdtfl="http://schemas.microsoft.com/office/word/2024/wordml/sdtformatlock" xmlns:w16se="http://schemas.microsoft.com/office/word/2015/wordml/symex" xmlns:w16du="http://schemas.microsoft.com/office/word/2023/wordml/word16du" xmlns:wne="http://schemas.microsoft.com/office/word/2006/wordml" mc:Ignorable="w14 w15 w16se w16cid w16 w16cex w16sdtdh w16sdtfl w16du wp14">
   <w:body>
     <w:p>
       <w:pPr>
@@ -142,30 +142,43 @@
     </w:p>
     <w:p>
       <w:pPr>
-        <w:spacing w:after="240"/>
-      </w:pPr>
-    </w:p>
-    <w:p>
-      <w:pPr>
-        <w:spacing w:after="240"/>
-      </w:pPr>
-    </w:p>
-    <w:p>
-      <w:pPr>
-        <w:spacing w:after="240"/>
-      </w:pPr>
-    </w:p>
-    <w:p>
-      <w:pPr>
         <w:jc w:val="center"/>
-      </w:pPr>
-      <w:r>
         <w:rPr>
           <w:color w:val="6E6E6E"/>
           <w:sz w:val="22"/>
           <w:szCs w:val="22"/>
         </w:rPr>
+      </w:pPr>
+      <w:r>
+        <w:rPr>
+          <w:color w:val="6E6E6E"/>
+          <w:sz w:val="22"/>
+          <w:szCs w:val="22"/>
+        </w:rPr>
         <w:t>Spanish Fort, Alabama</w:t>
+      </w:r>
+    </w:p>
+    <w:p>
+      <w:pPr>
+        <w:jc w:val="center"/>
+        <w:rPr>
+          <w:color w:val="6E6E6E"/>
+          <w:sz w:val="22"/>
+          <w:szCs w:val="22"/>
+        </w:rPr>
+      </w:pPr>
+    </w:p>
+    <w:p>
+      <w:pPr>
+        <w:jc w:val="center"/>
+      </w:pPr>
+      <w:r>
+        <w:rPr>
+          <w:color w:val="6E6E6E"/>
+          <w:sz w:val="22"/>
+          <w:szCs w:val="22"/>
+        </w:rPr>
+        <w:t xml:space="preserve">Created by Claude by ingesting all Spanish Fort Monthlies, Pastor Notes, public committee documents, sermons, bulletins, churchwide emails, and additional church-related materials. </w:t>
       </w:r>
     </w:p>
     <w:p>
@@ -218,15 +231,29 @@
         <w:spacing w:after="120" w:line="320" w:lineRule="auto"/>
       </w:pPr>
       <w:r>
-        <w:t xml:space="preserve">The wave swept across the United Methodist Church. Like many congregations throughout the country, this season caused division within the congregation at Spanish Fort UMC. Some wanted to disaffiliate; others did not. Though there are varying accounts of how things ended the way they did, the church remained in the United Methodist denomination. </w:t>
-      </w:r>
-    </w:p>
-    <w:p>
-      <w:pPr>
-        <w:spacing w:after="120" w:line="320" w:lineRule="auto"/>
-      </w:pPr>
-      <w:r>
-        <w:t>As a result about 117 families left. Most of them, roughly 200 people, created a new congregation three miles down the road. Other families scattered to congregations around the area. When the dust settled, the church had lost close to 40% of its membership and about $658,672 in annual household giving.</w:t>
+        <w:t xml:space="preserve">The wave swept across the United Methodist Church. Like many congregations throughout the country, this season caused division within the congregation at Spanish Fort UMC. Some wanted to disaffiliate; others did not. Though there are varying accounts of how things </w:t>
+      </w:r>
+      <w:r>
+        <w:t xml:space="preserve">transpired, the ultimate result was that </w:t>
+      </w:r>
+      <w:r>
+        <w:t xml:space="preserve">the church remained in the United Methodist denomination. </w:t>
+      </w:r>
+    </w:p>
+    <w:p>
+      <w:pPr>
+        <w:spacing w:after="120" w:line="320" w:lineRule="auto"/>
+      </w:pPr>
+      <w:r>
+        <w:t xml:space="preserve">As a </w:t>
+      </w:r>
+      <w:proofErr w:type="gramStart"/>
+      <w:r>
+        <w:t>result</w:t>
+      </w:r>
+      <w:proofErr w:type="gramEnd"/>
+      <w:r>
+        <w:t xml:space="preserve"> about 117 families left. Most of them, roughly 200 people, created a new congregation three miles down the road. Other families scattered to congregations around the area. When the dust settled, the church had lost close to 40% of its membership and about $658,672 in annual household giving.</w:t>
       </w:r>
     </w:p>
     <w:p>
@@ -242,27 +269,55 @@
         <w:spacing w:after="120" w:line="320" w:lineRule="auto"/>
       </w:pPr>
       <w:r>
-        <w:t>In the months between the announcement and the move, the church navigated the uncertainty it faced. Half the staff was gone or going. The longtime executive assistant to Bill Price was retiring. The business manager left. The Rev. Mike Owenby had been on staff less than a year. The Preschool Director resigned. And the church was already in an extended search for a Children's Minister.</w:t>
-      </w:r>
-    </w:p>
-    <w:p>
-      <w:pPr>
-        <w:spacing w:after="120" w:line="320" w:lineRule="auto"/>
-      </w:pPr>
-      <w:r>
-        <w:t xml:space="preserve">In 2023, the church carried 8 full-time and 7 part-time staff. By the end of 2024, the staff consisted of 4 full-time and 7 part-time positions. The 2024 budget, drafted with the new realities in view, came in at $1.25 million. The 2023 budget was $1.7 million. The gap between those two numbers was the real shape of the disaffiliation, and the gap </w:t>
+        <w:t xml:space="preserve">In the months between the announcement and the move, the church navigated the uncertainty it faced. Half the staff was gone or going. The longtime executive assistant to Bill Price was retiring. The business manager left. The Rev. Mike Owenby had been on staff less than a year. The Preschool Director resigned. And the church was already in an extended search for a </w:t>
+      </w:r>
+      <w:proofErr w:type="gramStart"/>
+      <w:r>
+        <w:t>Children's Minister</w:t>
+      </w:r>
+      <w:proofErr w:type="gramEnd"/>
+      <w:r>
+        <w:t>.</w:t>
+      </w:r>
+    </w:p>
+    <w:p>
+      <w:pPr>
+        <w:spacing w:after="120" w:line="320" w:lineRule="auto"/>
+      </w:pPr>
+      <w:r>
+        <w:t>In 2023, the church carried 8 full-time and 7 part-time staff</w:t>
+      </w:r>
+      <w:r>
+        <w:t>, down from 13 full-time and four part-time in 2019</w:t>
+      </w:r>
+      <w:r>
+        <w:t xml:space="preserve">. By the end of 2024, the staff consisted of 4 full-time and 7 part-time positions. The 2024 budget, drafted with the new realities in view, came in at $1.25 million. The 2023 budget was $1.7 million. The gap between those two numbers was the </w:t>
       </w:r>
       <w:r>
         <w:lastRenderedPageBreak/>
-        <w:t>between the 2024 budget and what the church would actually receive in 2024 was a question nobody could yet answer.</w:t>
-      </w:r>
-    </w:p>
-    <w:p>
-      <w:pPr>
-        <w:spacing w:after="120" w:line="320" w:lineRule="auto"/>
-      </w:pPr>
-      <w:r>
-        <w:t>Woods would preach his first sermon at SFUMC on the second Sunday of July 2024. The first official Church Council followed in August. Between those two dates, the work began in small but important ways.</w:t>
+        <w:t xml:space="preserve">real shape of the disaffiliation, and the gap between the 2024 budget and what the church would </w:t>
+      </w:r>
+      <w:proofErr w:type="gramStart"/>
+      <w:r>
+        <w:t>actually receive</w:t>
+      </w:r>
+      <w:proofErr w:type="gramEnd"/>
+      <w:r>
+        <w:t xml:space="preserve"> in 2024 was a question nobody could yet answer.</w:t>
+      </w:r>
+    </w:p>
+    <w:p>
+      <w:pPr>
+        <w:spacing w:after="120" w:line="320" w:lineRule="auto"/>
+      </w:pPr>
+      <w:r>
+        <w:t xml:space="preserve">Woods </w:t>
+      </w:r>
+      <w:r>
+        <w:t>preached</w:t>
+      </w:r>
+      <w:r>
+        <w:t xml:space="preserve"> his first sermon at SFUMC on the second Sunday of July 2024. The first official Church Council followed in August. </w:t>
       </w:r>
     </w:p>
     <w:p>
@@ -402,15 +457,31 @@
         <w:spacing w:after="120" w:line="320" w:lineRule="auto"/>
       </w:pPr>
       <w:r>
-        <w:t>The Finance Committee met four days later, on August 19. Shannon Brown was elected Church Treasurer. The committee took up early planning for the Commitment Campaign that would launch with the September sermon series. It also reviewed cash management strategies aimed at securing better interest rates while keeping funds inside FDIC insurance limits, and approved continued planning for the proposed November migration to a new church management software platform.</w:t>
-      </w:r>
-    </w:p>
-    <w:p>
-      <w:pPr>
-        <w:spacing w:after="120" w:line="320" w:lineRule="auto"/>
-      </w:pPr>
-      <w:r>
-        <w:t>S.A.L.T., the senior adults ministry, capped its August calendar with an Ice Cream Social on the 22nd.</w:t>
+        <w:t xml:space="preserve">The Finance Committee met four days later, on August 19. Shannon Brown was elected Church Treasurer. The committee took up early planning for the Commitment Campaign that would launch with the September sermon series. It also reviewed cash management strategies aimed at securing better interest rates while keeping funds inside FDIC insurance </w:t>
+      </w:r>
+      <w:proofErr w:type="gramStart"/>
+      <w:r>
+        <w:t>limits, and</w:t>
+      </w:r>
+      <w:proofErr w:type="gramEnd"/>
+      <w:r>
+        <w:t xml:space="preserve"> approved continued planning for the proposed November migration to a new church management software platform.</w:t>
+      </w:r>
+    </w:p>
+    <w:p>
+      <w:pPr>
+        <w:spacing w:after="120" w:line="320" w:lineRule="auto"/>
+      </w:pPr>
+      <w:r>
+        <w:t xml:space="preserve">S.A.L.T., the senior </w:t>
+      </w:r>
+      <w:proofErr w:type="gramStart"/>
+      <w:r>
+        <w:t>adults</w:t>
+      </w:r>
+      <w:proofErr w:type="gramEnd"/>
+      <w:r>
+        <w:t xml:space="preserve"> ministry, capped its August calendar with an Ice Cream Social on the 22nd.</w:t>
       </w:r>
     </w:p>
     <w:p>
@@ -461,7 +532,23 @@
         <w:spacing w:after="120" w:line="320" w:lineRule="auto"/>
       </w:pPr>
       <w:r>
-        <w:t xml:space="preserve">The same Sunday carried more than the first sermon of the new series. The reorganized children's Sunday-evening program opened that evening at the West Campus, with age-based groups meeting at the same time. Little Lights gathered pre-K through kindergarten, Shine Kids took the early elementary grades, and Connect met iwith the fourth through sixth grade. The new children's choir began at 5:00 the same evening. The Sanctuary Choir would begin Christmas music rehearsals on September 10. Hand bell choirs returned to the schedule that same week. The Worship Planning meetings </w:t>
+        <w:t xml:space="preserve">The same Sunday carried more than the first sermon of the new series. The reorganized children's Sunday-evening program opened that evening at the West Campus, with age-based groups meeting at the same time. Little Lights gathered pre-K through kindergarten, Shine Kids took the early elementary </w:t>
+      </w:r>
+      <w:proofErr w:type="gramStart"/>
+      <w:r>
+        <w:t>grades, and</w:t>
+      </w:r>
+      <w:proofErr w:type="gramEnd"/>
+      <w:r>
+        <w:t xml:space="preserve"> Connect met </w:t>
+      </w:r>
+      <w:proofErr w:type="spellStart"/>
+      <w:r>
+        <w:t>iwith</w:t>
+      </w:r>
+      <w:proofErr w:type="spellEnd"/>
+      <w:r>
+        <w:t xml:space="preserve"> the fourth through sixth grade. The new children's choir began at 5:00 the same evening. The Sanctuary Choir would begin Christmas music rehearsals on September 10. Hand bell choirs returned to the schedule that same week. The Worship Planning meetings </w:t>
       </w:r>
       <w:r>
         <w:lastRenderedPageBreak/>
@@ -565,7 +652,15 @@
         <w:spacing w:after="120" w:line="320" w:lineRule="auto"/>
       </w:pPr>
       <w:r>
-        <w:t>The week after Commitment Sunday, the full staff drove together to the Walters' house on Fish River for the first staff offsite retreat of Woods's tenure on October 11. The offices closed for the day. Both full-time and part-time staff attended. The day was spent on team-building and on planning the 2025 calendar.</w:t>
+        <w:t xml:space="preserve">The week after Commitment Sunday, the full staff drove together to the Walters' house on Fish River for the first staff offsite retreat of Woods's tenure on October 11. The offices closed for the day. Both full-time and part-time staff attended. The day was spent on </w:t>
+      </w:r>
+      <w:proofErr w:type="gramStart"/>
+      <w:r>
+        <w:t>team-building</w:t>
+      </w:r>
+      <w:proofErr w:type="gramEnd"/>
+      <w:r>
+        <w:t xml:space="preserve"> and on planning the 2025 calendar.</w:t>
       </w:r>
     </w:p>
     <w:p>
@@ -593,7 +688,15 @@
         <w:spacing w:after="120" w:line="320" w:lineRule="auto"/>
       </w:pPr>
       <w:r>
-        <w:t>Personnel changes continued. Brandon Marcus, was hired as Accompanist to replace longtime organist Wanda Cooper, who had resigned in September after thirty-plus years of faithful service. Robin Ross came on board as Executive Assistant. Summerlyn Middleton came on board in Communications and as Assistant Youth Director. With those additions, the program and office staff positions were filled.</w:t>
+        <w:t xml:space="preserve">Personnel changes continued. </w:t>
+      </w:r>
+      <w:proofErr w:type="gramStart"/>
+      <w:r>
+        <w:t>Brandon Marcus,</w:t>
+      </w:r>
+      <w:proofErr w:type="gramEnd"/>
+      <w:r>
+        <w:t xml:space="preserve"> was hired as Accompanist to replace longtime organist Wanda Cooper, who had resigned in September after thirty-plus years of faithful service. Robin Ross came on board as Executive Assistant. Summerlyn Middleton came on board in Communications and as Assistant Youth Director. With those additions, the program and office staff positions were filled.</w:t>
       </w:r>
     </w:p>
     <w:p>
@@ -617,7 +720,15 @@
         <w:spacing w:after="120" w:line="320" w:lineRule="auto"/>
       </w:pPr>
       <w:r>
-        <w:t>The Trustees reported that Sun Coast Energy was now under contract to maintain the church's seventeen air-conditioning units. Two Mama's cleaning service had been renegotiated to roughly half of what the church had been paying. An internet and IT systems upgrade through Warren Tech Solutions had been approved at a cost capped at $8,000. The stolen church trailer, which had not been recovered, would move to an insurance claim. The Finance Committee, under chair Kerry Vix, presented an IntraFi banking proposal that would let the church spread its sitting funds across multiple FDIC-insured banks while keeping a single primary relationship with Cedar Rapids State Bank.</w:t>
+        <w:t xml:space="preserve">The Trustees reported that Sun Coast Energy was now under contract to maintain the church's seventeen air-conditioning units. Two Mama's cleaning service had been renegotiated to roughly half of what the church had been paying. An internet and IT systems upgrade through Warren Tech Solutions had been approved at a cost capped at $8,000. The stolen church trailer, which had not been recovered, would move to an insurance claim. The Finance Committee, under chair Kerry Vix, presented an </w:t>
+      </w:r>
+      <w:proofErr w:type="spellStart"/>
+      <w:r>
+        <w:t>IntraFi</w:t>
+      </w:r>
+      <w:proofErr w:type="spellEnd"/>
+      <w:r>
+        <w:t xml:space="preserve"> banking proposal that would let the church spread its sitting funds across multiple FDIC-insured banks while keeping a single primary relationship with Cedar Rapids State Bank.</w:t>
       </w:r>
     </w:p>
     <w:p>
@@ -668,23 +779,47 @@
         <w:spacing w:after="120" w:line="320" w:lineRule="auto"/>
       </w:pPr>
       <w:r>
-        <w:t>The church's migration to a new church management software system, ShelbyNext, began in November. The migration had been on the calendar since August. The new platform was meant to function as the church's database, giving platform, directory, and event registration hub. The old database, Realm, would be retired over the coming weeks.</w:t>
-      </w:r>
-    </w:p>
-    <w:p>
-      <w:pPr>
-        <w:spacing w:after="120" w:line="320" w:lineRule="auto"/>
-      </w:pPr>
-      <w:r>
-        <w:t>The Missions Team focused its November efforts on a Veterans Supply Drive and on "Project Blankets," a churchwide collection of new and gently-used clean blankets for the homeless of Mobile, with Sharon Brammer as the contact person. Baldwin Family Village remained an active partner. SFUMC continued to serve dinners on the Family Promise rotation.</w:t>
-      </w:r>
-    </w:p>
-    <w:p>
-      <w:pPr>
-        <w:spacing w:after="120" w:line="320" w:lineRule="auto"/>
-      </w:pPr>
-      <w:r>
-        <w:t>On Monday, November 25, the Church Council met for the next-to-last meeting of the year. Fifteen members were present plus guests. The Finance Committee under Kerry Vix confirmed the church would move forward with the IntraFi banking consolidation. Apportionment payments to the conference were on track to be renegotiated downward from $109,000 to $74,000 for 2025, reflecting SFUMC's smaller membership post-disaffiliation. The 2025 Preliminary Budget would be presented in detail at the December meeting.</w:t>
+        <w:t xml:space="preserve">The church's migration to a new church management software system, </w:t>
+      </w:r>
+      <w:proofErr w:type="spellStart"/>
+      <w:r>
+        <w:t>ShelbyNext</w:t>
+      </w:r>
+      <w:proofErr w:type="spellEnd"/>
+      <w:r>
+        <w:t>, began in November. The migration had been on the calendar since August. The new platform was meant to function as the church's database, giving platform, directory, and event registration hub. The old database, Realm, would be retired over the coming weeks.</w:t>
+      </w:r>
+    </w:p>
+    <w:p>
+      <w:pPr>
+        <w:spacing w:after="120" w:line="320" w:lineRule="auto"/>
+      </w:pPr>
+      <w:r>
+        <w:t xml:space="preserve">The Missions Team focused its November efforts on a Veterans Supply Drive and on "Project Blankets," a churchwide collection of new and </w:t>
+      </w:r>
+      <w:proofErr w:type="gramStart"/>
+      <w:r>
+        <w:t>gently-used</w:t>
+      </w:r>
+      <w:proofErr w:type="gramEnd"/>
+      <w:r>
+        <w:t xml:space="preserve"> clean blankets for the homeless of Mobile, with Sharon Brammer as the contact person. Baldwin Family Village remained an active partner. SFUMC continued to serve dinners on the Family Promise rotation.</w:t>
+      </w:r>
+    </w:p>
+    <w:p>
+      <w:pPr>
+        <w:spacing w:after="120" w:line="320" w:lineRule="auto"/>
+      </w:pPr>
+      <w:r>
+        <w:t xml:space="preserve">On Monday, November 25, the Church Council met for the next-to-last meeting of the year. Fifteen members were present plus guests. The Finance Committee under Kerry Vix confirmed the church would move forward with the </w:t>
+      </w:r>
+      <w:proofErr w:type="spellStart"/>
+      <w:r>
+        <w:t>IntraFi</w:t>
+      </w:r>
+      <w:proofErr w:type="spellEnd"/>
+      <w:r>
+        <w:t xml:space="preserve"> banking consolidation. Apportionment payments to the conference were on track to be renegotiated downward from $109,000 to $74,000 for 2025, reflecting SFUMC's smaller membership post-disaffiliation. The 2025 Preliminary Budget would be presented in detail at the December meeting.</w:t>
       </w:r>
     </w:p>
     <w:p>
@@ -723,7 +858,23 @@
         <w:spacing w:after="120" w:line="320" w:lineRule="auto"/>
       </w:pPr>
       <w:r>
-        <w:t>The PrimeTimers Christmas Party was held on December 3 in the Fellowship Hall with a Moe's BBQ dinner catered. The next Saturday, December 7, the United Methodist Men hosted Family Breakfast with Santa in the Fellowship Hall.</w:t>
+        <w:t xml:space="preserve">The </w:t>
+      </w:r>
+      <w:proofErr w:type="spellStart"/>
+      <w:r>
+        <w:t>PrimeTimers</w:t>
+      </w:r>
+      <w:proofErr w:type="spellEnd"/>
+      <w:r>
+        <w:t xml:space="preserve"> Christmas Party was held on December 3 in the Fellowship Hall with a Moe's BBQ dinner catered. The next Saturday, December 7, the United Methodist Men </w:t>
+      </w:r>
+      <w:proofErr w:type="gramStart"/>
+      <w:r>
+        <w:t>hosted</w:t>
+      </w:r>
+      <w:proofErr w:type="gramEnd"/>
+      <w:r>
+        <w:t xml:space="preserve"> Family Breakfast with Santa in the Fellowship Hall.</w:t>
       </w:r>
     </w:p>
     <w:p>
@@ -825,7 +976,15 @@
         <w:spacing w:after="120" w:line="320" w:lineRule="auto"/>
       </w:pPr>
       <w:r>
-        <w:t>January 26, 2025 was the day SFUMC drew a line between its first season of recovery and the season that would follow. That evening, the church held a joint orientation for its administrative teams, launched its new Vision Team, restarted its overlapping Sunday-night discipleship programming, and opened a new four-week sermon series called The Simple Things. The first weeks of January worked toward that Sunday, and the rest of the quarter built outward from it.</w:t>
+        <w:t xml:space="preserve">January 26, </w:t>
+      </w:r>
+      <w:proofErr w:type="gramStart"/>
+      <w:r>
+        <w:t>2025</w:t>
+      </w:r>
+      <w:proofErr w:type="gramEnd"/>
+      <w:r>
+        <w:t xml:space="preserve"> was the day SFUMC drew a line between its first season of recovery and the season that would follow. That evening, the church held a joint orientation for its administrative teams, launched its new Vision Team, restarted its overlapping Sunday-night discipleship programming, and opened a new four-week sermon series called The Simple Things. The first weeks of January worked toward that Sunday, and the rest of the quarter built outward from it.</w:t>
       </w:r>
     </w:p>
     <w:p>
@@ -848,15 +1007,31 @@
         <w:spacing w:after="120" w:line="320" w:lineRule="auto"/>
       </w:pPr>
       <w:r>
-        <w:t>The new year opened with the church already operating on a different calendar. The Church Council had voted in December to move from monthly to bi-monthly meetings for 2025, with the monthly brochure continuing on its regular cadence. The Finance Committee adopted the same rhythm and would now meet in the same months as the Council. The first Finance Committee meeting of the year was scheduled for January 26, with Blair Lober taking over as Finance Chair.</w:t>
-      </w:r>
-    </w:p>
-    <w:p>
-      <w:pPr>
-        <w:spacing w:after="120" w:line="320" w:lineRule="auto"/>
-      </w:pPr>
-      <w:r>
-        <w:t>The migration to ShelbyNext, which began in November, was completed in January. The new database now functions as the church's platform for membership management, online giving, financial reporting, event registration, and the directory. Realm was retired. Robin Ross in the church office took over the role of helping members set up their Shelby accounts.</w:t>
+        <w:t xml:space="preserve">The new year opened with the church already operating on a different calendar. The Church Council had voted in December to move from monthly to bi-monthly meetings for 2025, with the monthly brochure </w:t>
+      </w:r>
+      <w:proofErr w:type="gramStart"/>
+      <w:r>
+        <w:t>continuing on</w:t>
+      </w:r>
+      <w:proofErr w:type="gramEnd"/>
+      <w:r>
+        <w:t xml:space="preserve"> its regular cadence. The Finance Committee adopted the same rhythm and would now meet in the same months as the Council. The first Finance Committee meeting of the year was scheduled for January 26, with Blair Lober taking over as Finance Chair.</w:t>
+      </w:r>
+    </w:p>
+    <w:p>
+      <w:pPr>
+        <w:spacing w:after="120" w:line="320" w:lineRule="auto"/>
+      </w:pPr>
+      <w:r>
+        <w:t xml:space="preserve">The migration to </w:t>
+      </w:r>
+      <w:proofErr w:type="spellStart"/>
+      <w:r>
+        <w:t>ShelbyNext</w:t>
+      </w:r>
+      <w:proofErr w:type="spellEnd"/>
+      <w:r>
+        <w:t>, which began in November, was completed in January. The new database now functions as the church's platform for membership management, online giving, financial reporting, event registration, and the directory. Realm was retired. Robin Ross in the church office took over the role of helping members set up their Shelby accounts.</w:t>
       </w:r>
     </w:p>
     <w:p>
@@ -892,7 +1067,15 @@
         <w:spacing w:after="120" w:line="320" w:lineRule="auto"/>
       </w:pPr>
       <w:r>
-        <w:t>Other January-specific events filled the calendar. PrimeTimers traveled to Gulf Shores State Park for a lecture on the history of pirates in the Gulf, and their Friday Nite Out on January 31 drew twenty-eight to the Fellowship Hall for a chili and soup supper and a screening of *Something the Lord Made*.</w:t>
+        <w:t xml:space="preserve">Other January-specific events filled the calendar. </w:t>
+      </w:r>
+      <w:proofErr w:type="spellStart"/>
+      <w:r>
+        <w:t>PrimeTimers</w:t>
+      </w:r>
+      <w:proofErr w:type="spellEnd"/>
+      <w:r>
+        <w:t xml:space="preserve"> traveled to Gulf Shores State Park for a lecture on the history of pirates in the Gulf, and their Friday Nite Out on January 31 drew twenty-eight to the Fellowship Hall for a chili and soup supper and a screening of *Something the Lord Made*.</w:t>
       </w:r>
     </w:p>
     <w:p>
@@ -915,7 +1098,15 @@
         <w:spacing w:after="120" w:line="320" w:lineRule="auto"/>
       </w:pPr>
       <w:r>
-        <w:t>February settled into the rhythm the new year had set. The Sunday morning calendar moved through the second half of The Simple Things. The Friday "Pastor's Note" emails began a long-running comparison of the church's ministry areas to rooms in a house, a frame Woods would carry through the spring. Children in grades three through six attended a Winter Retreat at Blue Lake on February 7 through 9.</w:t>
+        <w:t xml:space="preserve">February settled into the rhythm the new year had set. The Sunday morning calendar moved through the second half of The Simple Things. The Friday "Pastor's Note" emails began a long-running comparison of the church's ministry areas to rooms in a </w:t>
+      </w:r>
+      <w:proofErr w:type="gramStart"/>
+      <w:r>
+        <w:t>house,</w:t>
+      </w:r>
+      <w:proofErr w:type="gramEnd"/>
+      <w:r>
+        <w:t xml:space="preserve"> a frame Woods would carry through the spring. Children in grades three through six attended a Winter Retreat at Blue Lake on February 7 through 9.</w:t>
       </w:r>
     </w:p>
     <w:p>
@@ -951,7 +1142,15 @@
         <w:spacing w:after="120" w:line="320" w:lineRule="auto"/>
       </w:pPr>
       <w:r>
-        <w:t>The new young(ish) adult men's group, which had met twice toward the end of 2024, settled into a monthly rhythm on the third Tuesday of each month. Kitsy Dixon completed her Sunday afternoon Forgiveness Challenge class on March 1, having walked a faithful group of participants through five weeks of work on releasing forgiveness in preparation for Lent.</w:t>
+        <w:t>The new young(</w:t>
+      </w:r>
+      <w:proofErr w:type="spellStart"/>
+      <w:r>
+        <w:t>ish</w:t>
+      </w:r>
+      <w:proofErr w:type="spellEnd"/>
+      <w:r>
+        <w:t>) adult men's group, which had met twice toward the end of 2024, settled into a monthly rhythm on the third Tuesday of each month. Kitsy Dixon completed her Sunday afternoon Forgiveness Challenge class on March 1, having walked a faithful group of participants through five weeks of work on releasing forgiveness in preparation for Lent.</w:t>
       </w:r>
     </w:p>
     <w:p>
@@ -1023,15 +1222,31 @@
         <w:spacing w:after="120" w:line="320" w:lineRule="auto"/>
       </w:pPr>
       <w:r>
-        <w:t>The PrimeTimers visited the Africatown Heritage House in Plateau on March 19 for a tour of the museum dedicated to the story of the *Clotilda* and the founding of Africatown. The group left the sanctuary parking lot at 9:30 AM and stopped at the Blue Gill restaurant for lunch on the return drive.</w:t>
-      </w:r>
-    </w:p>
-    <w:p>
-      <w:pPr>
-        <w:spacing w:after="120" w:line="320" w:lineRule="auto"/>
-      </w:pPr>
-      <w:r>
-        <w:t>The Church Council met for the first time of 2025 on Monday, March 24 in the Fellowship Hall. Tim Dozier presented the finished logo and visual identity work from Hummingbird Ideas to the Council that night, closing out the design process the Council had launched with him at the September 23, 2024 meeting. The reports from all five administrative teams reflected the rhythm that had been built across the first quarter. The Trustees report covered active repairs and inspections including the Fire Marshall walkthrough, Hunter Security inspection, gutter installation at the rear of the Resource Building, exterior light repair at West Campus, plumbing fixes, restroom painting in the Fellowship Hall, and pothole repairs handled by trustee John Tyler and his sons. The SPRC report was light. The Finance report covered the year-to-date surplus and the work on internal controls. Family Life Ministries, a new committee that had taken shape over the winter, presented plans for a Family Beach Day in June, a Family Breakfast in August, a flood-bucket assembly day, a Family Movie Night, and a possible Pool Party at the Bay Minette Pool.</w:t>
+        <w:t xml:space="preserve">The </w:t>
+      </w:r>
+      <w:proofErr w:type="spellStart"/>
+      <w:r>
+        <w:t>PrimeTimers</w:t>
+      </w:r>
+      <w:proofErr w:type="spellEnd"/>
+      <w:r>
+        <w:t xml:space="preserve"> visited the Africatown Heritage House in Plateau on March 19 for a tour of the museum dedicated to the story of the *Clotilda* and the founding of Africatown. The group left the sanctuary parking lot at 9:30 AM and stopped at the Blue Gill restaurant for lunch on the return drive.</w:t>
+      </w:r>
+    </w:p>
+    <w:p>
+      <w:pPr>
+        <w:spacing w:after="120" w:line="320" w:lineRule="auto"/>
+      </w:pPr>
+      <w:r>
+        <w:t xml:space="preserve">The Church Council met for the first time of 2025 on Monday, March 24 in the Fellowship Hall. Tim Dozier presented the finished logo and visual identity work from Hummingbird Ideas to the Council that night, closing out the design process the Council had launched with him at the September 23, </w:t>
+      </w:r>
+      <w:proofErr w:type="gramStart"/>
+      <w:r>
+        <w:t>2024</w:t>
+      </w:r>
+      <w:proofErr w:type="gramEnd"/>
+      <w:r>
+        <w:t xml:space="preserve"> meeting. The reports from all five administrative teams reflected the rhythm that had been built across the first quarter. The Trustees report covered active repairs and inspections including the Fire Marshall walkthrough, Hunter Security inspection, gutter installation at the rear of the Resource Building, exterior light repair at West Campus, plumbing fixes, restroom painting in the Fellowship Hall, and pothole repairs handled by trustee John Tyler and his sons. The SPRC report was light. The Finance report covered the year-to-date surplus and the work on internal controls. Family Life Ministries, a new committee that had taken shape over the winter, presented plans for a Family Beach Day in June, a Family Breakfast in August, a flood-bucket assembly day, a Family Movie Night, and a possible Pool Party at the Bay Minette Pool.</w:t>
       </w:r>
     </w:p>
     <w:p>
@@ -1074,7 +1289,29 @@
           <w:szCs w:val="44"/>
         </w:rPr>
         <w:lastRenderedPageBreak/>
-        <w:t>Chapter 4: The First Year Closes</w:t>
+        <w:t xml:space="preserve">Chapter 4: The </w:t>
+      </w:r>
+      <w:proofErr w:type="gramStart"/>
+      <w:r>
+        <w:rPr>
+          <w:b/>
+          <w:bCs/>
+          <w:color w:val="1A2E4A"/>
+          <w:sz w:val="44"/>
+          <w:szCs w:val="44"/>
+        </w:rPr>
+        <w:t>First Year</w:t>
+      </w:r>
+      <w:proofErr w:type="gramEnd"/>
+      <w:r>
+        <w:rPr>
+          <w:b/>
+          <w:bCs/>
+          <w:color w:val="1A2E4A"/>
+          <w:sz w:val="44"/>
+          <w:szCs w:val="44"/>
+        </w:rPr>
+        <w:t xml:space="preserve"> Closes</w:t>
       </w:r>
     </w:p>
     <w:p>
@@ -1132,7 +1369,15 @@
         <w:spacing w:after="120" w:line="320" w:lineRule="auto"/>
       </w:pPr>
       <w:r>
-        <w:t>The week prior, on Saturday, April 5, the church had held the "Lend a Hand" Churchwide Serve Day at the Main Campus. More than forty-one volunteers across all ages turned out. The work included grounds beautification on the church property along with related cleanup. Sunday, April 6, was the Easter Celebration. The plan was a Trunk Hop in the parking lot from 4:00 to 5:30 PM, but a heavy rainstorm forced the entire event indoors. Volunteers adapted their trunks into indoor activity stations. The Children's Ministry, Family Life Ministries, and a corps of trunk volunteers turned out in droves. The PrimeTimers contributed the cookies and a cake walk.</w:t>
+        <w:t xml:space="preserve">The week prior, on Saturday, April 5, the church had held the "Lend a Hand" Churchwide Serve Day at the Main Campus. More than forty-one volunteers across all ages turned out. The work included grounds beautification on the church property along with related cleanup. Sunday, April 6, was the Easter Celebration. The plan was a Trunk Hop in the parking lot from 4:00 to 5:30 PM, but a heavy rainstorm forced the entire event indoors. Volunteers adapted their trunks into indoor activity stations. The Children's Ministry, Family Life Ministries, and a corps of trunk volunteers turned out in droves. The </w:t>
+      </w:r>
+      <w:proofErr w:type="spellStart"/>
+      <w:r>
+        <w:t>PrimeTimers</w:t>
+      </w:r>
+      <w:proofErr w:type="spellEnd"/>
+      <w:r>
+        <w:t xml:space="preserve"> contributed the cookies and a cake walk.</w:t>
       </w:r>
     </w:p>
     <w:p>
@@ -1245,7 +1490,15 @@
         <w:spacing w:after="120" w:line="320" w:lineRule="auto"/>
       </w:pPr>
       <w:r>
-        <w:t>S.A.L.T. cancelled its May meeting but ran a Perdido Queen river cruise on May 20 with twenty-one PrimeTimers attending. The group boarded at the Mobile Convention Center and toured the Port of Mobile for an hour and a half, then ate an early supper at the new Moe's BBQ in Daphne.</w:t>
+        <w:t xml:space="preserve">S.A.L.T. cancelled its May meeting but ran a Perdido Queen river cruise on May 20 with twenty-one </w:t>
+      </w:r>
+      <w:proofErr w:type="spellStart"/>
+      <w:r>
+        <w:t>PrimeTimers</w:t>
+      </w:r>
+      <w:proofErr w:type="spellEnd"/>
+      <w:r>
+        <w:t xml:space="preserve"> attending. The group boarded at the Mobile Convention Center and toured the Port of Mobile for an hour and a half, then ate an early supper at the new Moe's BBQ in Daphne.</w:t>
       </w:r>
     </w:p>
     <w:p>
@@ -1317,7 +1570,15 @@
         <w:spacing w:after="120" w:line="320" w:lineRule="auto"/>
       </w:pPr>
       <w:r>
-        <w:t>The first Vision Team listening session ran on Tuesday, June 10. The schedule eventually carried six sessions across June and into early July, each capped at fifteen participants, each guided by open-ended questions about the future of the church. By the time of the May brochure, Woods had named in his Senior Pastor's report four directions the Vision Team was developing toward: a recommendation that the Trustees consider forming a building committee to take up the question of the physical campus, an exploration of a new churchwide missional effort along the lines of the Uniform Closet or Prodisee Pantry that had defined earlier generations of SFUMC's outreach, a reorganization and renaming of adult discipleship offerings for clarity and accessibility, and a relational-connection track that would create new ways for people to build meaningful relationships within the congregation. The Vision Team committed to bringing a full report around Labor Day.</w:t>
+        <w:t xml:space="preserve">The first Vision Team listening session ran on Tuesday, June 10. The schedule eventually carried six sessions across June and into early July, each capped at fifteen participants, each guided by open-ended questions about the future of the church. By the time of the May brochure, Woods had named in his Senior Pastor's report four directions the Vision Team was developing toward: a recommendation that the Trustees consider forming a building committee to take up the question of the physical campus, an exploration of a new churchwide missional effort along the lines of the Uniform Closet or </w:t>
+      </w:r>
+      <w:proofErr w:type="spellStart"/>
+      <w:r>
+        <w:t>Prodisee</w:t>
+      </w:r>
+      <w:proofErr w:type="spellEnd"/>
+      <w:r>
+        <w:t xml:space="preserve"> Pantry that had defined earlier generations of SFUMC's outreach, a reorganization and renaming of adult discipleship offerings for clarity and accessibility, and a relational-connection track that would create new ways for people to build meaningful relationships within the congregation. The Vision Team committed to bringing a full report around Labor Day.</w:t>
       </w:r>
     </w:p>
     <w:p>
@@ -1333,7 +1594,15 @@
         <w:spacing w:after="120" w:line="320" w:lineRule="auto"/>
       </w:pPr>
       <w:r>
-        <w:t>The Trustees met on June 16. The report covered ongoing maintenance, the new Facility Use Policy fee schedule, emergency preparedness ahead of hurricane season, and a sanctuary lighting consultation with Mediamerge ahead of considering an LED conversion. The Reed Building front doors and several windows were planned for repair.</w:t>
+        <w:t xml:space="preserve">The Trustees met on June 16. The report covered ongoing maintenance, the new Facility Use Policy fee schedule, emergency preparedness ahead of hurricane season, and a sanctuary lighting consultation with </w:t>
+      </w:r>
+      <w:proofErr w:type="spellStart"/>
+      <w:r>
+        <w:t>Mediamerge</w:t>
+      </w:r>
+      <w:proofErr w:type="spellEnd"/>
+      <w:r>
+        <w:t xml:space="preserve"> ahead of considering an LED conversion. The Reed Building front doors and several windows were planned for repair.</w:t>
       </w:r>
     </w:p>
     <w:p>
@@ -1350,7 +1619,15 @@
         <w:spacing w:after="120" w:line="320" w:lineRule="auto"/>
       </w:pPr>
       <w:r>
-        <w:t>The June Senior Pastor's report in the brochure was a year-end retrospective. The Director of Finance and Operations reported a year-to-date surplus of $295,425.32 through May. The Church Council, Finance Committee, Trustees, Nominations, and SPRC were operating on their new every-other-month rhythm. More than seventy people had joined SFUMC since July 2024. ShelbyNext was in place as the church's database. Woods named in his report nine areas of ministry: Welcoming and Evangelism, Prayer and Care, Missions and Service, Discipleship, Worship, Fellowship and Connection, Operations, Administration and Leadership, and Family Life and Events. The report closed with the goodbye to Pastor Kitsy and the welcome to Pastor Sarah.</w:t>
+        <w:t xml:space="preserve">The June Senior Pastor's report in the brochure was a year-end retrospective. The Director of Finance and Operations reported a year-to-date surplus of $295,425.32 through May. The Church Council, Finance Committee, Trustees, Nominations, and SPRC were operating on their new every-other-month rhythm. More than seventy people had joined SFUMC since July 2024. </w:t>
+      </w:r>
+      <w:proofErr w:type="spellStart"/>
+      <w:r>
+        <w:t>ShelbyNext</w:t>
+      </w:r>
+      <w:proofErr w:type="spellEnd"/>
+      <w:r>
+        <w:t xml:space="preserve"> was in place as the church's database. Woods named in his report nine areas of ministry: Welcoming and Evangelism, Prayer and Care, Missions and Service, Discipleship, Worship, Fellowship and Connection, Operations, Administration and Leadership, and Family Life and Events. The report closed with the goodbye to Pastor Kitsy and the welcome to Pastor Sarah.</w:t>
       </w:r>
     </w:p>
     <w:p>
@@ -1403,7 +1680,15 @@
         <w:spacing w:after="120" w:line="320" w:lineRule="auto"/>
       </w:pPr>
       <w:r>
-        <w:t>The third quarter of 2025 was the first quarter of Year Two in this new season and the quarter the church's new vision went public. The Vision Team that had launched in January wrapped its meetings in July and brought its report to the Church Council on July 28. Vision Sunday on August 17 carried that report out to the congregation, launched the new mission and vision statements, and opened the Welcome Home sermon series that ran through the rest of the quarter. Sarah Roberts arrived as the new Associate Pastor at the start of July. Sean Harnas was hired as the new Youth Minister and began in August. Margie Walters joined the staff as Executive Administrative Assistant after Labor Day. The Trustees voted to form a Building Committee. The Welcome Home series closed on September 28 with Commitment Sunday, which fell at the leading edge of a season the Lisenby family did not see coming.</w:t>
+        <w:t xml:space="preserve">The third quarter of 2025 was the first quarter of Year Two in this new </w:t>
+      </w:r>
+      <w:proofErr w:type="gramStart"/>
+      <w:r>
+        <w:t>season</w:t>
+      </w:r>
+      <w:proofErr w:type="gramEnd"/>
+      <w:r>
+        <w:t xml:space="preserve"> and the quarter the church's new vision went public. The Vision Team that had launched in January wrapped its meetings in July and brought its report to the Church Council on July 28. Vision Sunday on August 17 carried that report out to the congregation, launched the new mission and vision statements, and opened the Welcome Home sermon series that ran through the rest of the quarter. Sarah Roberts arrived as the new Associate Pastor at the start of July. Sean Harnas was hired as the new Youth Minister and began in August. Margie Walters joined the staff as Executive Administrative Assistant after Labor Day. The Trustees voted to form a Building Committee. The Welcome Home series closed on September 28 with Commitment Sunday, which fell at the leading edge of a season the Lisenby family did not see coming.</w:t>
       </w:r>
     </w:p>
     <w:p>
@@ -1434,7 +1719,15 @@
         <w:spacing w:after="120" w:line="320" w:lineRule="auto"/>
       </w:pPr>
       <w:r>
-        <w:t>The summer sermon calendar moved through the four-week series "Rhythm" beginning July 20. The series was anchored in a thesis that balance is an illusion and that what actually orders a life is a pattern of priorities that makes room for the unexpected. The four weeks took up faith, family, work, and rest in that order. Week 1, "Evidence of Things Unseen," from Proverbs 3 and Hebrews 11, distinguished faith as trust from faith as belief.</w:t>
+        <w:t xml:space="preserve">The summer sermon calendar moved through the four-week series "Rhythm" beginning July 20. The series was anchored in a thesis that balance is an illusion and that what </w:t>
+      </w:r>
+      <w:proofErr w:type="gramStart"/>
+      <w:r>
+        <w:t>actually orders</w:t>
+      </w:r>
+      <w:proofErr w:type="gramEnd"/>
+      <w:r>
+        <w:t xml:space="preserve"> a life is a pattern of priorities that makes room for the unexpected. The four weeks took up faith, family, work, and rest in that order. Week 1, "Evidence of Things Unseen," from Proverbs 3 and Hebrews 11, distinguished faith as trust from faith as belief.</w:t>
       </w:r>
     </w:p>
     <w:p>
@@ -1500,7 +1793,15 @@
       </w:pPr>
       <w:r>
         <w:lastRenderedPageBreak/>
-        <w:t>The same meeting noted that Robin Ross had accepted a position in Fairhope and would be leaving the SFUMC staff while continuing to attend as a member. The Realm online-giving platform was discontinued on July 31, and online giving transitioned fully to ShelbyNext.</w:t>
+        <w:t xml:space="preserve">The same meeting noted that Robin Ross had accepted a position in Fairhope and would be leaving the SFUMC staff while continuing to attend as a member. The Realm online-giving platform was discontinued on July 31, and online giving transitioned fully to </w:t>
+      </w:r>
+      <w:proofErr w:type="spellStart"/>
+      <w:r>
+        <w:t>ShelbyNext</w:t>
+      </w:r>
+      <w:proofErr w:type="spellEnd"/>
+      <w:r>
+        <w:t>.</w:t>
       </w:r>
     </w:p>
     <w:p>
@@ -1531,7 +1832,15 @@
         <w:spacing w:after="120" w:line="320" w:lineRule="auto"/>
       </w:pPr>
       <w:r>
-        <w:t>August opened with two welcomes and a series of preparations for what August 17 would carry. The first Sunday, August 3, included a 9:45 AM Welcome Reception for Sarah Roberts in the Main Campus. That evening, Remedy ran its Back to School Bash at Eastern Shore Lanes. The Rhythm series closed out on August 10 with "Don't Forget to Breathe" from Mark 4, the chapter's installment on rest. The 8:45 AM service that morning included a Blessing of the Backpacks for students and teachers, the scripture printed on each backpack tag taken from John 13:34.</w:t>
+        <w:t xml:space="preserve">August opened with two welcomes and a series of preparations for what August 17 would carry. The first Sunday, August 3, included a 9:45 AM Welcome Reception for Sarah Roberts in the Main Campus. That evening, Remedy ran its Back to School Bash at Eastern Shore Lanes. The Rhythm series closed out on August 10 with "Don't Forget to Breathe" from Mark 4, the chapter's installment on rest. The 8:45 AM service that morning included a Blessing of the Backpacks for students and </w:t>
+      </w:r>
+      <w:proofErr w:type="gramStart"/>
+      <w:r>
+        <w:t>teachers,</w:t>
+      </w:r>
+      <w:proofErr w:type="gramEnd"/>
+      <w:r>
+        <w:t xml:space="preserve"> the scripture printed on each backpack tag taken from John 13:34.</w:t>
       </w:r>
     </w:p>
     <w:p>
@@ -1547,7 +1856,15 @@
         <w:spacing w:after="120" w:line="320" w:lineRule="auto"/>
       </w:pPr>
       <w:r>
-        <w:t>The Staff-Parish Relations Committee met on August 14. The committee scheduled a second-interview for a Youth Minister candidate on Sunday, August 17 at 4:00 PM, with time built in for the candidate to meet with students during the visit. The committee approved the hire of Margie Walters as Executive Administrative Assistant, with her start date set for after Labor Day. The committee was also briefed on a set of new website features that the communications work had produced over the summer: an "I'm new" landing button, an online merchandise store, an upcoming-events page, and a digital commitment card built for the September pledge drive.</w:t>
+        <w:t xml:space="preserve">The Staff-Parish Relations Committee met on August 14. The committee scheduled a </w:t>
+      </w:r>
+      <w:proofErr w:type="gramStart"/>
+      <w:r>
+        <w:t>second-interview</w:t>
+      </w:r>
+      <w:proofErr w:type="gramEnd"/>
+      <w:r>
+        <w:t xml:space="preserve"> for a Youth Minister candidate on Sunday, August 17 at 4:00 PM, with time built in for the candidate to meet with students during the visit. The committee approved the hire of Margie Walters as Executive Administrative Assistant, with her start date set for after Labor Day. The committee was also briefed on a set of new website features that the communications work had produced over the summer: an "I'm new" landing button, an online merchandise store, an upcoming-events page, and a digital commitment card built for the September pledge drive.</w:t>
       </w:r>
     </w:p>
     <w:p>
@@ -1575,7 +1892,23 @@
         <w:spacing w:after="120" w:line="320" w:lineRule="auto"/>
       </w:pPr>
       <w:r>
-        <w:t>The Welcome Home series continued on August 24 with "A Place at the Table" from Luke 14:15-24, on the great banquet parable and on radical hospitality. That afternoon at 5:30 PM the church held a churchwide Dinner and Ice Cream Social in the Fellowship Hall. The church provided hamburgers and hot dogs. The congregation brought sides. The PrimeTimers brought ice cream and dessert. Roughly 130 adults and children attended. The Welcome Home Week 3 sermon followed on August 31, "The Greatest Among You," from Matthew 20:20-28.</w:t>
+        <w:t xml:space="preserve">The Welcome Home series </w:t>
+      </w:r>
+      <w:proofErr w:type="gramStart"/>
+      <w:r>
+        <w:t>continued on</w:t>
+      </w:r>
+      <w:proofErr w:type="gramEnd"/>
+      <w:r>
+        <w:t xml:space="preserve"> August 24 with "A Place at the Table" from Luke 14:15-24, on the great banquet parable and on radical hospitality. That afternoon at 5:30 PM the church held a churchwide Dinner and Ice Cream Social in the Fellowship Hall. The church provided hamburgers and hot dogs. The congregation brought sides. The </w:t>
+      </w:r>
+      <w:proofErr w:type="spellStart"/>
+      <w:r>
+        <w:t>PrimeTimers</w:t>
+      </w:r>
+      <w:proofErr w:type="spellEnd"/>
+      <w:r>
+        <w:t xml:space="preserve"> brought ice cream and dessert. Roughly 130 adults and children attended. The Welcome Home Week 3 sermon followed on August 31, "The Greatest Among You," from Matthew 20:20-28.</w:t>
       </w:r>
     </w:p>
     <w:p>
@@ -1591,7 +1924,15 @@
         <w:spacing w:after="120" w:line="320" w:lineRule="auto"/>
       </w:pPr>
       <w:r>
-        <w:t>August closed with a $1,953.02 monthly surplus and a year-to-date surplus of $240,358.37 through July 31. The Director of Finance and Operations noted that a portion of the July surplus reflected housing-assistance income from the District received to support the new Associate Pastor's transition.</w:t>
+        <w:t xml:space="preserve">August closed with a $1,953.02 monthly surplus and a year-to-date surplus of $240,358.37 through July 31. The Director of Finance and Operations noted that a portion of the July surplus reflected housing-assistance income from the </w:t>
+      </w:r>
+      <w:proofErr w:type="gramStart"/>
+      <w:r>
+        <w:t>District</w:t>
+      </w:r>
+      <w:proofErr w:type="gramEnd"/>
+      <w:r>
+        <w:t xml:space="preserve"> received to support the new Associate Pastor's transition.</w:t>
       </w:r>
     </w:p>
     <w:p>
@@ -1642,7 +1983,15 @@
         <w:spacing w:after="120" w:line="320" w:lineRule="auto"/>
       </w:pPr>
       <w:r>
-        <w:t>Margie Walters started in the office after Labor Day. Her early work picked up the day-to-day administrative thread Robin Ross had been carrying, including ShelbyNext database management and the church's standing event calendar. She and Sarah began their early planning for Dinner Church.</w:t>
+        <w:t xml:space="preserve">Margie Walters started in the office after Labor Day. Her early work picked up the day-to-day administrative thread Robin Ross had been carrying, including </w:t>
+      </w:r>
+      <w:proofErr w:type="spellStart"/>
+      <w:r>
+        <w:t>ShelbyNext</w:t>
+      </w:r>
+      <w:proofErr w:type="spellEnd"/>
+      <w:r>
+        <w:t xml:space="preserve"> database management and the church's standing event calendar. She and Sarah began their early planning for Dinner Church.</w:t>
       </w:r>
     </w:p>
     <w:p>
@@ -1683,15 +2032,31 @@
         <w:spacing w:after="120" w:line="320" w:lineRule="auto"/>
       </w:pPr>
       <w:r>
-        <w:t>The September 8 Trustees report also carried a piece of insurance news. A clerical error reaching back to 2015 had omitted the square footage of the Walgreens and Power 88 leased space from the property insurance policy. The carrier had now corrected the policy. Property insurance for the term ending April 1, 2026 would rise by roughly $7,700.</w:t>
-      </w:r>
-    </w:p>
-    <w:p>
-      <w:pPr>
-        <w:spacing w:after="120" w:line="320" w:lineRule="auto"/>
-      </w:pPr>
-      <w:r>
-        <w:t>The PrimeTimers ran a September outing to Gulf State Park on Tuesday, September 23 to hear a "Race to the Moon" presentation at the Nature Center, with lunch beforehand at DeSoto Seafood Kitchen.</w:t>
+        <w:t xml:space="preserve">The September 8 Trustees report also carried a piece of insurance news. A clerical error reaching back to 2015 had omitted the square footage of the Walgreens and Power 88 leased space from the property insurance policy. The carrier had now corrected the policy. Property insurance for the term ending April 1, </w:t>
+      </w:r>
+      <w:proofErr w:type="gramStart"/>
+      <w:r>
+        <w:t>2026</w:t>
+      </w:r>
+      <w:proofErr w:type="gramEnd"/>
+      <w:r>
+        <w:t xml:space="preserve"> would rise by roughly $7,700.</w:t>
+      </w:r>
+    </w:p>
+    <w:p>
+      <w:pPr>
+        <w:spacing w:after="120" w:line="320" w:lineRule="auto"/>
+      </w:pPr>
+      <w:r>
+        <w:t xml:space="preserve">The </w:t>
+      </w:r>
+      <w:proofErr w:type="spellStart"/>
+      <w:r>
+        <w:t>PrimeTimers</w:t>
+      </w:r>
+      <w:proofErr w:type="spellEnd"/>
+      <w:r>
+        <w:t xml:space="preserve"> ran a September outing to Gulf State Park on Tuesday, September 23 to hear a "Race to the Moon" presentation at the Nature Center, with lunch beforehand at DeSoto Seafood Kitchen.</w:t>
       </w:r>
     </w:p>
     <w:p>
@@ -1836,15 +2201,31 @@
         <w:spacing w:after="120" w:line="320" w:lineRule="auto"/>
       </w:pPr>
       <w:r>
-        <w:t>The Trustees met during the month. The committee took up the sanctuary lighting project that had been on the agenda since August. Media Merge's two LED conversion options had landed in the $200,000 range with additional scaffolding cost on top. The committee voted to hold the project. The fixtures, mostly original to the late-1990s sanctuary build-out, would be replaced incrementally with bulbs the church had on hand. A West Campus HVAC main unit failed during the month and was replaced by SunCoast for $28,040.</w:t>
-      </w:r>
-    </w:p>
-    <w:p>
-      <w:pPr>
-        <w:spacing w:after="120" w:line="320" w:lineRule="auto"/>
-      </w:pPr>
-      <w:r>
-        <w:t>The same Trustees report carried more on the West Campus insurance correction that had surfaced in September. The carrier's review had concluded that the West Campus measured 42,000 square feet rather than the 23,314 square feet the policy had carried since the 2015 clerical entry. The corrected coverage value would be $5,418,000. The current coverage was $3,000,000. The committee looked seriously at increasing coverage to the corrected value, and concluded that the church could not afford the premium. The policy stayed at $3,000,000 for the term ending April 1, 2026.</w:t>
+        <w:t xml:space="preserve">The Trustees met during the month. The committee took up the sanctuary lighting project that had been on the agenda since August. Media Merge's two LED conversion options had landed in the $200,000 range with additional scaffolding cost on top. The committee voted to hold the project. The fixtures, mostly original to the late-1990s sanctuary build-out, would be replaced incrementally with bulbs the church had on hand. A West Campus HVAC main unit failed during the month and was replaced by </w:t>
+      </w:r>
+      <w:proofErr w:type="spellStart"/>
+      <w:r>
+        <w:t>SunCoast</w:t>
+      </w:r>
+      <w:proofErr w:type="spellEnd"/>
+      <w:r>
+        <w:t xml:space="preserve"> for $28,040.</w:t>
+      </w:r>
+    </w:p>
+    <w:p>
+      <w:pPr>
+        <w:spacing w:after="120" w:line="320" w:lineRule="auto"/>
+      </w:pPr>
+      <w:r>
+        <w:t xml:space="preserve">The same Trustees report carried more on the West Campus insurance correction that had surfaced in September. The carrier's review had concluded that the West Campus measured 42,000 square feet rather than the 23,314 square feet the policy had carried since the 2015 clerical entry. The corrected coverage value would be $5,418,000. The current coverage was $3,000,000. The committee looked seriously at increasing coverage to the corrected </w:t>
+      </w:r>
+      <w:proofErr w:type="gramStart"/>
+      <w:r>
+        <w:t>value, and</w:t>
+      </w:r>
+      <w:proofErr w:type="gramEnd"/>
+      <w:r>
+        <w:t xml:space="preserve"> concluded that the church could not afford the premium. The policy stayed at $3,000,000 for the term ending April 1, 2026.</w:t>
       </w:r>
     </w:p>
     <w:p>
@@ -1900,7 +2281,15 @@
         <w:spacing w:after="120" w:line="320" w:lineRule="auto"/>
       </w:pPr>
       <w:r>
-        <w:t>Sunday, November 2, was the Pastor Appreciation Fellowship at 9:45 AM in the Main Campus. The morning marked the church's annual practice of acknowledging the pastoral staff. That same Sunday opened the four-week Why Worry sermon series from Matthew 6. The series ran through November 23. The four weeks worked through five topics built around the things Jesus names in the chapter: Fashion, Finances, the Future, Family, and Food. The series ran in parallel with the Advent devotional Sarah Roberts had selected for the church, Kate Bowler's *The Season of Waiting (and waiting... and waiting...)*, a free online study scheduled to begin on November 30 with the first Sunday of Advent.</w:t>
+        <w:t>Sunday, November 2, was the Pastor Appreciation Fellowship at 9:45 AM in the Main Campus. The morning marked the church's annual practice of acknowledging the pastoral staff. That same Sunday opened the four-week Why Worry sermon series from Matthew 6. The series ran through November 23. The four weeks worked through five topics built around the things Jesus names in the chapter: Fashion, Finances, the Future, Family, and Food. The series ran in parallel with the Advent devotional Sarah Roberts had selected for the church, Kate Bowler's *The Season of Waiting (and waiting... and waiting</w:t>
+      </w:r>
+      <w:proofErr w:type="gramStart"/>
+      <w:r>
+        <w:t>...)*</w:t>
+      </w:r>
+      <w:proofErr w:type="gramEnd"/>
+      <w:r>
+        <w:t>, a free online study scheduled to begin on November 30 with the first Sunday of Advent.</w:t>
       </w:r>
     </w:p>
     <w:p>
@@ -1920,7 +2309,15 @@
       </w:r>
       <w:r>
         <w:lastRenderedPageBreak/>
-        <w:t>land within range of its budgeted line. Non-pledged giving was running well below the budgeted figure, with the year's non-pledged budget projected at roughly thirty percent over what had actually come in.</w:t>
+        <w:t xml:space="preserve">land within range of its budgeted line. Non-pledged giving was running well below the budgeted figure, with the year's non-pledged budget projected at roughly thirty percent over what had </w:t>
+      </w:r>
+      <w:proofErr w:type="gramStart"/>
+      <w:r>
+        <w:t>actually come</w:t>
+      </w:r>
+      <w:proofErr w:type="gramEnd"/>
+      <w:r>
+        <w:t xml:space="preserve"> in.</w:t>
       </w:r>
     </w:p>
     <w:p>
@@ -1944,7 +2341,15 @@
         <w:spacing w:after="120" w:line="320" w:lineRule="auto"/>
       </w:pPr>
       <w:r>
-        <w:t>The 2026 plan as drafted projected revenue of about $1,011,041, expenses of about $1,197,041, and a deficit of $181,359. The Finance Committee was holding steady on program and personnel. The committee felt that further expense cuts would limit future growth, and would instead support staff efforts to pursue new revenue lines. The new lines being worked on included a 501(c)(3) for compassion-related ministries that could open access to federal grant dollars, advertising revenue from member-owned businesses, possible Lilly Foundation pastoral-development funds shared with other local United Methodist churches, and a Rummage Sale or Thrift Store that would offset mission-related giving. The letter named the underlying conviction. 2024 had been an assessment year. 2025 had been a planning year. 2026 would be the implementation year, and the work would need time.</w:t>
+        <w:t xml:space="preserve">The 2026 plan as drafted projected revenue of about $1,011,041, expenses of about $1,197,041, and a deficit of $181,359. The Finance Committee was holding steady on program and personnel. The committee felt that further expense cuts would limit future </w:t>
+      </w:r>
+      <w:proofErr w:type="gramStart"/>
+      <w:r>
+        <w:t>growth, and</w:t>
+      </w:r>
+      <w:proofErr w:type="gramEnd"/>
+      <w:r>
+        <w:t xml:space="preserve"> would instead support staff efforts to pursue new revenue lines. The new lines being worked on included a 501(c)(3) for compassion-related ministries that could open access to federal grant dollars, advertising revenue from member-owned businesses, possible Lilly Foundation pastoral-development funds shared with other local United Methodist churches, and a Rummage Sale or Thrift Store that would offset mission-related giving. The letter named the underlying conviction. 2024 had been an assessment year. 2025 had been a planning year. 2026 would be the implementation year, and the work would need time.</w:t>
       </w:r>
     </w:p>
     <w:p>
@@ -1961,15 +2366,31 @@
       </w:pPr>
       <w:r>
         <w:lastRenderedPageBreak/>
-        <w:t>Wednesday, November 19, the Preschool hosted the Poarch Creek Tribe for a Pow Wow event followed by pie and fellowship. Children and families took in a traditional song-and-dance demonstration and a brief introduction to the tribe's history in the area. The same morning the PrimeTimers ran a day trip to Foley for lunch at the Magnolia Hotel restaurant and an afternoon of museum and downtown visits.</w:t>
-      </w:r>
-    </w:p>
-    <w:p>
-      <w:pPr>
-        <w:spacing w:after="120" w:line="320" w:lineRule="auto"/>
-      </w:pPr>
-      <w:r>
-        <w:t>Thursday, November 20, was Church Council. The Council reviewed the November financial report, the 2026 budget letter, the Walgreens lease, the Trustees' Resource Building demolition recommendation, and the year-end calendar of worship and family events. The slate of 2026 leaders was confirmed and ready for January installation.</w:t>
+        <w:t xml:space="preserve">Wednesday, November 19, the Preschool hosted the Poarch Creek Tribe for a Pow Wow event followed by pie and fellowship. Children and families took in a traditional song-and-dance demonstration and a brief introduction to the tribe's history in the area. The same morning the </w:t>
+      </w:r>
+      <w:proofErr w:type="spellStart"/>
+      <w:r>
+        <w:t>PrimeTimers</w:t>
+      </w:r>
+      <w:proofErr w:type="spellEnd"/>
+      <w:r>
+        <w:t xml:space="preserve"> ran a day trip to Foley for lunch at the Magnolia Hotel restaurant and an afternoon of museum and downtown visits.</w:t>
+      </w:r>
+    </w:p>
+    <w:p>
+      <w:pPr>
+        <w:spacing w:after="120" w:line="320" w:lineRule="auto"/>
+      </w:pPr>
+      <w:r>
+        <w:t xml:space="preserve">Thursday, November 20, was Church Council. The Council reviewed the November financial report, the 2026 budget letter, the Walgreens lease, the Trustees' Resource Building demolition recommendation, and the year-end calendar of worship and family events. The slate of 2026 leaders </w:t>
+      </w:r>
+      <w:proofErr w:type="gramStart"/>
+      <w:r>
+        <w:t>was</w:t>
+      </w:r>
+      <w:proofErr w:type="gramEnd"/>
+      <w:r>
+        <w:t xml:space="preserve"> confirmed and ready for January installation.</w:t>
       </w:r>
     </w:p>
     <w:p>
@@ -2041,7 +2462,15 @@
         <w:spacing w:after="120" w:line="320" w:lineRule="auto"/>
       </w:pPr>
       <w:r>
-        <w:t>Friday, December 12, was the PrimeTimers Christmas Party in the Fellowship Hall at 5:30 PM. The meal carried teriyaki pork tenderloin, sides, and dessert. Robert McMillan read from "A Christmas Carol." Mike Owenby, Robert McMillan, and Brandon Marcus led carols. The pastors and staff joined for the evening.</w:t>
+        <w:t xml:space="preserve">Friday, December 12, was the </w:t>
+      </w:r>
+      <w:proofErr w:type="spellStart"/>
+      <w:r>
+        <w:t>PrimeTimers</w:t>
+      </w:r>
+      <w:proofErr w:type="spellEnd"/>
+      <w:r>
+        <w:t xml:space="preserve"> Christmas Party in the Fellowship Hall at 5:30 PM. The meal carried teriyaki pork tenderloin, sides, and dessert. Robert McMillan read from "A Christmas Carol." Mike Owenby, Robert McMillan, and Brandon Marcus led carols. The pastors and staff joined for the evening.</w:t>
       </w:r>
     </w:p>
     <w:p>
@@ -2143,7 +2572,23 @@
         <w:spacing w:after="120" w:line="320" w:lineRule="auto"/>
       </w:pPr>
       <w:r>
-        <w:t>The first quarter of 2026 began the work the prior year had been planning toward. The November 2025 budget letter had named the year's posture in three sentences: 2024 had been an assessment year, 2025 had been a planning year, and 2026 would be the implementation year. The first quarter carried the early installments of that work. The new slate of 2026 lay leaders was installed on the first Sunday of January, with every committee position filled for the first time in Woods's tenure, including the new Study and Building Committee. The What Makes Us Us sermon series ran through January and into early February, laying out the Wesleyan theology the new vision was meant to express in practice. The Leaning Into Lent series began on the first Sunday of Lent and ran through Palm Sunday. The Community Dinner ministry that Sarah Roberts and Margie Walters had been planning since the previous summer launched its first Monday-night meal on March 23. Sarah took on the Thrift Store work with Joanna Bass through the quarter, building toward the inaugural Pop-Up Thrift Store later in April. The 2026 budget was on the books with its projected $181,359 deficit. The Finance Committee was holding to its plan to absorb the deficit through new revenue lines, with further cuts to program or personnel ruled out as a risk to future growth.</w:t>
+        <w:t xml:space="preserve">The first quarter of 2026 began the work the prior year had been planning toward. The November 2025 budget letter had named the year's posture in three sentences: 2024 had been an assessment year, 2025 had been a planning year, and 2026 would be the implementation year. The first quarter carried the early installments of that work. The new slate of 2026 lay leaders was installed on the first Sunday of January, with every committee position filled for the first time in Woods's tenure, including the new Study and Building Committee. The What Makes Us </w:t>
+      </w:r>
+      <w:proofErr w:type="spellStart"/>
+      <w:r>
+        <w:t>Us</w:t>
+      </w:r>
+      <w:proofErr w:type="spellEnd"/>
+      <w:r>
+        <w:t xml:space="preserve"> sermon series ran through January and into early February, laying out the Wesleyan theology the new vision was meant to express in practice. The Leaning </w:t>
+      </w:r>
+      <w:proofErr w:type="gramStart"/>
+      <w:r>
+        <w:t>Into</w:t>
+      </w:r>
+      <w:proofErr w:type="gramEnd"/>
+      <w:r>
+        <w:t xml:space="preserve"> Lent series began on the first Sunday of Lent and ran through Palm Sunday. The Community Dinner ministry that Sarah Roberts and Margie Walters had been planning since the previous summer launched its first Monday-night meal on March 23. Sarah took on the Thrift Store work with Joanna Bass through the quarter, building toward the inaugural Pop-Up Thrift Store later in April. The 2026 budget was on the books with its projected $181,359 deficit. The Finance Committee was holding to its plan to absorb the deficit through new revenue lines, with further cuts to program or personnel ruled out as a risk to future growth.</w:t>
       </w:r>
     </w:p>
     <w:p>
@@ -2174,7 +2619,23 @@
         <w:spacing w:after="120" w:line="320" w:lineRule="auto"/>
       </w:pPr>
       <w:r>
-        <w:t xml:space="preserve">That morning opened the What Makes Us Us sermon series. The series ran six weeks, through Sunday, February 8, and worked through the Wesleyan tradition the church now operated under. Week 1, "Outward and Visible," from Acts 2, took up the sacraments as means of grace. Week 2, "More to Grace," from Ephesians 2 and Luke 15, walked through prevenient, justifying, and sanctifying grace. Week 3, "The Word of God For the People of God," from Luke 24 and 2 Timothy 3, took up the Wesleyan approach </w:t>
+        <w:t xml:space="preserve">That morning opened the What Makes Us </w:t>
+      </w:r>
+      <w:proofErr w:type="spellStart"/>
+      <w:r>
+        <w:t>Us</w:t>
+      </w:r>
+      <w:proofErr w:type="spellEnd"/>
+      <w:r>
+        <w:t xml:space="preserve"> sermon series. The series ran six weeks, through Sunday, February 8, and worked through the Wesleyan tradition the church now operated under. Week 1, "Outward and Visible," from Acts 2, took up the sacraments as means of grace. Week 2, "More to Grace," from Ephesians 2 and Luke 15, walked through prevenient, justifying, and sanctifying grace. Week 3, "The Word of God </w:t>
+      </w:r>
+      <w:proofErr w:type="gramStart"/>
+      <w:r>
+        <w:t>For</w:t>
+      </w:r>
+      <w:proofErr w:type="gramEnd"/>
+      <w:r>
+        <w:t xml:space="preserve"> the People of God," from Luke 24 and 2 Timothy 3, took up the Wesleyan approach </w:t>
       </w:r>
       <w:r>
         <w:lastRenderedPageBreak/>
@@ -2193,8 +2654,13 @@
       <w:pPr>
         <w:spacing w:after="120" w:line="320" w:lineRule="auto"/>
       </w:pPr>
-      <w:r>
-        <w:t>The Costa Rica spring trip interest meeting was held during the month. Sarah Roberts had named two 2026 trips in her November pastor's report: a general trip from April 18 through April 25 and a youth trip from July 25 through August 1. The January meeting opened sign-ups and walked through the trip's costs and the practical details. A spaghetti dinner fundraiser was planned for February.</w:t>
+      <w:proofErr w:type="gramStart"/>
+      <w:r>
+        <w:t>The Costa Rica spring</w:t>
+      </w:r>
+      <w:proofErr w:type="gramEnd"/>
+      <w:r>
+        <w:t xml:space="preserve"> trip interest meeting was held during the month. Sarah Roberts had named two 2026 trips in her November pastor's report: a general trip from April 18 through April 25 and a youth trip from July 25 through August 1. The January meeting opened sign-ups and walked through the trip's costs and the practical details. A spaghetti dinner fundraiser was planned for February.</w:t>
       </w:r>
     </w:p>
     <w:p>
@@ -2241,7 +2707,15 @@
         <w:spacing w:after="120" w:line="320" w:lineRule="auto"/>
       </w:pPr>
       <w:r>
-        <w:t>Sunday, February 1, was Week 5 of What Makes Us Us, "The Less You Know," from Daniel 2. That afternoon at 4:30 PM the West Campus hosted the Community Dinner Interest Meeting. The dinner ministry that Sarah Roberts and Margie Walters had been developing through the fall and the holiday season was opening its volunteer roster ahead of its March launch.</w:t>
+        <w:t xml:space="preserve">Sunday, February 1, was Week 5 of What Makes Us </w:t>
+      </w:r>
+      <w:proofErr w:type="spellStart"/>
+      <w:r>
+        <w:t>Us</w:t>
+      </w:r>
+      <w:proofErr w:type="spellEnd"/>
+      <w:r>
+        <w:t>, "The Less You Know," from Daniel 2. That afternoon at 4:30 PM the West Campus hosted the Community Dinner Interest Meeting. The dinner ministry that Sarah Roberts and Margie Walters had been developing through the fall and the holiday season was opening its volunteer roster ahead of its March launch.</w:t>
       </w:r>
     </w:p>
     <w:p>
@@ -2258,7 +2732,15 @@
       </w:pPr>
       <w:r>
         <w:lastRenderedPageBreak/>
-        <w:t>Sunday, February 8, closed the What Makes Us Us series with Week 6, "Why This Matters." That evening at 5:00 PM the West Campus held a Big Game Tailgate Fellowship, with congregational food.</w:t>
+        <w:t xml:space="preserve">Sunday, February 8, closed the What Makes Us </w:t>
+      </w:r>
+      <w:proofErr w:type="spellStart"/>
+      <w:r>
+        <w:t>Us</w:t>
+      </w:r>
+      <w:proofErr w:type="spellEnd"/>
+      <w:r>
+        <w:t xml:space="preserve"> series with Week 6, "Why This Matters." That evening at 5:00 PM the West Campus held a Big Game Tailgate Fellowship, with congregational food.</w:t>
       </w:r>
     </w:p>
     <w:p>
@@ -2298,7 +2780,15 @@
         <w:spacing w:after="120" w:line="320" w:lineRule="auto"/>
       </w:pPr>
       <w:r>
-        <w:t>The Leaning Into Lent sermon series began on Sunday, February 22, the first Sunday of Lent. The series ran six weeks, through Palm Sunday on March 29, and followed the Revised Common Lectionary readings for the season. Week 1 took up the Wilderness theme from the Sunday's lectionary. A weekday podcast ran in parallel with the series, offering shorter devotional reflections during the week. The podcast was the church's first foray into a regular audio-publication rhythm beyond the Sunday-morning service.</w:t>
+        <w:t xml:space="preserve">The Leaning </w:t>
+      </w:r>
+      <w:proofErr w:type="gramStart"/>
+      <w:r>
+        <w:t>Into</w:t>
+      </w:r>
+      <w:proofErr w:type="gramEnd"/>
+      <w:r>
+        <w:t xml:space="preserve"> Lent sermon series began on Sunday, February 22, the first Sunday of Lent. The series ran six weeks, through Palm Sunday on March 29, and followed the Revised Common Lectionary readings for the season. Week 1 took up the Wilderness theme from the Sunday's lectionary. A weekday podcast ran in parallel with the series, offering shorter devotional reflections during the week. The podcast was the church's first foray into a regular audio-publication rhythm beyond the Sunday-morning service.</w:t>
       </w:r>
     </w:p>
     <w:p>
@@ -2337,7 +2827,15 @@
         <w:spacing w:after="120" w:line="320" w:lineRule="auto"/>
       </w:pPr>
       <w:r>
-        <w:t xml:space="preserve">The Leaning Into Lent series continued through March across five Sundays. The lectionary moved through Abram's call, the woman at the well, the man born blind, </w:t>
+        <w:t xml:space="preserve">The Leaning </w:t>
+      </w:r>
+      <w:proofErr w:type="gramStart"/>
+      <w:r>
+        <w:t>Into</w:t>
+      </w:r>
+      <w:proofErr w:type="gramEnd"/>
+      <w:r>
+        <w:t xml:space="preserve"> Lent series continued through March across five Sundays. The lectionary moved through Abram's call, the woman at the well, the man born blind, </w:t>
       </w:r>
       <w:r>
         <w:lastRenderedPageBreak/>
@@ -2381,7 +2879,15 @@
         <w:spacing w:after="120" w:line="320" w:lineRule="auto"/>
       </w:pPr>
       <w:r>
-        <w:t>Sunday, March 29 was Palm Sunday. The church held a single combined service at 10:00 AM at the Main Campus. The Leaning Into Lent series closed with the Palm Sunday reading. That afternoon at 4:00 PM the church held its annual Easter Celebration in the parking lot. The 2025 Easter Celebration on April 6 and the 2025 Fall Festival on October 26 had both been rained out and moved indoors; the 2026 Easter Celebration ran as planned, in the parking lot, with the Children's Ministry coordinating activities and the Family Life Ministries Committee handling the food.</w:t>
+        <w:t xml:space="preserve">Sunday, March 29 was Palm Sunday. The church held a single combined service at 10:00 AM at the Main Campus. The Leaning </w:t>
+      </w:r>
+      <w:proofErr w:type="gramStart"/>
+      <w:r>
+        <w:t>Into</w:t>
+      </w:r>
+      <w:proofErr w:type="gramEnd"/>
+      <w:r>
+        <w:t xml:space="preserve"> Lent series closed with the Palm Sunday reading. That afternoon at 4:00 PM the church held its annual Easter Celebration in the parking lot. The 2025 Easter Celebration on April 6 and the 2025 Fall Festival on October 26 had both been rained out and moved indoors; the 2026 Easter Celebration ran as planned, in the parking lot, with the Children's Ministry coordinating activities and the Family Life Ministries Committee handling the food.</w:t>
       </w:r>
     </w:p>
     <w:p>
@@ -2443,7 +2949,23 @@
         <w:spacing w:after="120" w:line="320" w:lineRule="auto"/>
       </w:pPr>
       <w:r>
-        <w:t>The eighth quarter of the two-year arc this book covers opened with Holy Week and ran toward Pentecost. Holy Week and Easter Sunday closed the Leaning Into Lent series and opened the Eastertide season the church kept as the year's primary baptism and new-membership window. The What If Jesus Was Serious? sermon series ran across Eastertide from John 14 of Easter morning into the Sermon on the Mount, with Sarah Roberts taking the first week. The inaugural Pop-Up Thrift Store opened over the weekend of April 23 and 24 and cleared more than $7,000 for the Missions line. The Costa Rica spring mission trip prepared to carry seventeen people during the upcoming trip in July. The Community Dinner that had launched in March settled into its Monday-night rhythm. The Pastor's Note added a weekly Mailbox feature in May built around answering congregant questions. The chapter closes here at the end of May with the second year of his appointment three weeks short of its completion.</w:t>
+        <w:t xml:space="preserve">The eighth quarter of the two-year arc this book covers opened with Holy Week and ran toward Pentecost. Holy Week and Easter Sunday closed the Leaning </w:t>
+      </w:r>
+      <w:proofErr w:type="gramStart"/>
+      <w:r>
+        <w:t>Into</w:t>
+      </w:r>
+      <w:proofErr w:type="gramEnd"/>
+      <w:r>
+        <w:t xml:space="preserve"> Lent series and opened the Eastertide season the church kept as the year's primary baptism and new-membership window. The What If Jesus Was Serious? sermon series ran across Eastertide from John 14 of Easter morning into the Sermon on the Mount, with Sarah Roberts taking the first week. The inaugural Pop-Up Thrift Store opened over the weekend of April 23 and 24 and cleared more than $7,000 for the Missions line. </w:t>
+      </w:r>
+      <w:proofErr w:type="gramStart"/>
+      <w:r>
+        <w:t>The Costa Rica spring</w:t>
+      </w:r>
+      <w:proofErr w:type="gramEnd"/>
+      <w:r>
+        <w:t xml:space="preserve"> mission trip prepared to carry seventeen people during the upcoming trip in July. The Community Dinner that had launched in March settled into its Monday-night rhythm. The Pastor's Note added a weekly Mailbox feature in May built around answering congregant questions. The chapter closes here at the end of May with the second year of his appointment three weeks short of its completion.</w:t>
       </w:r>
     </w:p>
     <w:p>
@@ -2466,7 +2988,15 @@
         <w:spacing w:after="120" w:line="320" w:lineRule="auto"/>
       </w:pPr>
       <w:r>
-        <w:t>Holy Week opened on Maundy Thursday, April 2, with a 6:00 PM service of communion in the sanctuary. Good Friday worship followed on April 3 at the same time. Both services carried the close of the Leaning Into Lent series.</w:t>
+        <w:t xml:space="preserve">Holy Week opened on Maundy Thursday, April 2, with a 6:00 PM service of communion in the sanctuary. Good Friday worship followed on April 3 at the same time. Both services carried the close of the Leaning </w:t>
+      </w:r>
+      <w:proofErr w:type="gramStart"/>
+      <w:r>
+        <w:t>Into</w:t>
+      </w:r>
+      <w:proofErr w:type="gramEnd"/>
+      <w:r>
+        <w:t xml:space="preserve"> Lent series.</w:t>
       </w:r>
     </w:p>
     <w:p>
@@ -2494,7 +3024,15 @@
       </w:r>
       <w:r>
         <w:lastRenderedPageBreak/>
-        <w:t>baptisms would be offered at the end of any service through Pentecost. The note included a calendar walk through the major Eastertide touchpoints and a long second half answering common questions about baptism in the United Methodist tradition. The April 17 note, "Judgment Isn't What We Think It Is," opened a doctrinal essay on the difference between salvific judgment and accountability inside the body of Christ. The note named the practice of prooftexting by name. It set up the following Sunday's sermon. The April 30 slot ran the monthly Senior Pastor's report as the Friday note instead, with a link to the new Spanish Fort Monthly brochure.</w:t>
+        <w:t xml:space="preserve">baptisms would be offered at the end of any service through Pentecost. The note included a calendar walk through the major Eastertide touchpoints and a long second half answering common questions about baptism in the United Methodist tradition. The April 17 note, "Judgment Isn't What We Think It Is," opened a doctrinal essay on the difference between salvific judgment and accountability inside the body of Christ. The note named the practice of </w:t>
+      </w:r>
+      <w:proofErr w:type="spellStart"/>
+      <w:r>
+        <w:t>prooftexting</w:t>
+      </w:r>
+      <w:proofErr w:type="spellEnd"/>
+      <w:r>
+        <w:t xml:space="preserve"> by name. It set up the following Sunday's sermon. The April 30 slot ran the monthly Senior Pastor's report as the Friday note instead, with a link to the new Spanish Fort Monthly brochure.</w:t>
       </w:r>
     </w:p>
     <w:p>
@@ -2510,7 +3048,15 @@
         <w:spacing w:after="120" w:line="320" w:lineRule="auto"/>
       </w:pPr>
       <w:r>
-        <w:t>The inaugural Pop-Up Thrift Store opened over the weekend of April 23 to 25 at the West Campus. Joanna Bass coordinated the operation as Thrift Store Coordinator. The Desotells and Sarah Roberts carried the volunteer team through the sorting and the weekend's sale operation. Families from Community Dinner came through the doors on Thursday and received clothes and household items before the sale opened to the public. The weekend cleared more than $7,000 for the Missions line. A debrief meeting was scheduled for the following month, with the next Pop-Up Thrift Store penciled for the fall.</w:t>
+        <w:t xml:space="preserve">The inaugural Pop-Up Thrift Store opened over the weekend of April 23 to 25 at the West Campus. Joanna Bass coordinated the operation as Thrift Store Coordinator. The </w:t>
+      </w:r>
+      <w:proofErr w:type="spellStart"/>
+      <w:r>
+        <w:t>Desotells</w:t>
+      </w:r>
+      <w:proofErr w:type="spellEnd"/>
+      <w:r>
+        <w:t xml:space="preserve"> and Sarah Roberts carried the volunteer team through the sorting and the weekend's sale operation. Families from Community Dinner came through the doors on Thursday and received clothes and household items before the sale opened to the public. The weekend cleared more than $7,000 for the Missions line. A debrief meeting was scheduled for the following month, with the next Pop-Up Thrift Store penciled for the fall.</w:t>
       </w:r>
     </w:p>
     <w:p>
@@ -2593,7 +3139,31 @@
         <w:spacing w:after="120" w:line="320" w:lineRule="auto"/>
       </w:pPr>
       <w:r>
-        <w:t xml:space="preserve">The Pastor's Note column carried a new feature on Friday, May 13. The "Mailbox" introduction announced a recurring section at the bottom of the Friday note in which Woods would answer a question or concern submitted by someone in the congregation. The note named the anonymity tension built into the format. Woods had been preaching directly against triangulation across the spring, and an anonymous-submission feature sat crosswise with that work. He surfaced the tension in the note and asked submitters to sign their questions when they could. The note then sampled three incoming questions to model the format. The first answered the question of where the church's mission line actually goes, naming Prodisee Pantry, Family Promise, Baldwin Family Village, Kidz Eatz, William Green Veterans Home, the USA Wesley Foundation, Embrace Alabama Kids, the church's missionary partners, the Community Dinner, the Thrift Store, and the Costa Rica adult and youth trips, and named that over $40,000 of the church's budget is tied to these mission lines. The second answered a question about </w:t>
+        <w:t xml:space="preserve">The Pastor's Note column carried a new feature on Friday, May 13. The "Mailbox" introduction announced a recurring section at the bottom of the Friday note in which Woods would answer a question or concern submitted by someone in the congregation. The note named the anonymity tension built into the format. Woods had been preaching directly against triangulation across the spring, and an anonymous-submission feature sat crosswise with that work. He surfaced the tension in the note and asked submitters to sign their questions when they could. The note then sampled three incoming questions to model the format. The first answered the question of where the church's mission line actually goes, naming </w:t>
+      </w:r>
+      <w:proofErr w:type="spellStart"/>
+      <w:r>
+        <w:t>Prodisee</w:t>
+      </w:r>
+      <w:proofErr w:type="spellEnd"/>
+      <w:r>
+        <w:t xml:space="preserve"> Pantry, Family Promise, Baldwin Family Village, </w:t>
+      </w:r>
+      <w:proofErr w:type="spellStart"/>
+      <w:r>
+        <w:t>Kidz</w:t>
+      </w:r>
+      <w:proofErr w:type="spellEnd"/>
+      <w:r>
+        <w:t xml:space="preserve"> </w:t>
+      </w:r>
+      <w:proofErr w:type="spellStart"/>
+      <w:r>
+        <w:t>Eatz</w:t>
+      </w:r>
+      <w:proofErr w:type="spellEnd"/>
+      <w:r>
+        <w:t xml:space="preserve">, William Green Veterans Home, the USA Wesley Foundation, Embrace Alabama Kids, the church's missionary partners, the Community Dinner, the Thrift Store, and the Costa Rica adult and youth trips, and named that over $40,000 of the church's budget is tied to these mission lines. The second answered a question about </w:t>
       </w:r>
       <w:r>
         <w:lastRenderedPageBreak/>
@@ -2605,15 +3175,33 @@
         <w:spacing w:after="120" w:line="320" w:lineRule="auto"/>
       </w:pPr>
       <w:r>
-        <w:t>The Pre-K Graduation was held on Friday, May 8 at 9:30 AM in the Main Campus. Thirteen Pre-K students graduated, the year's class.</w:t>
-      </w:r>
-    </w:p>
-    <w:p>
-      <w:pPr>
-        <w:spacing w:after="120" w:line="320" w:lineRule="auto"/>
-      </w:pPr>
-      <w:r>
-        <w:t>Sunday, May 17 was Senior Sunday and Ascension Sunday. The 9:45 AM Senior Recognition moment in the Fellowship Hall opened the morning with a churchwide breakfast. The 11:00 AM service carried the recognition of the year's high-school graduates. The sermon closed the What If Jesus Was Serious? series with "Hearers vs Doers" from Matthew 7:24-29. The sermon used the Mars Climate Orbiter as its opening hook, named the prosperity gospel, Christian nationalism,as counterfeit theologies a congregation needs to be able to recognize, and named four warning signs of counterfeit faith in any tradition.</w:t>
+        <w:t xml:space="preserve">The Pre-K Graduation was held on Friday, May 8 at 9:30 AM in the Main Campus. Thirteen </w:t>
+      </w:r>
+      <w:proofErr w:type="gramStart"/>
+      <w:r>
+        <w:t>Pre-K</w:t>
+      </w:r>
+      <w:proofErr w:type="gramEnd"/>
+      <w:r>
+        <w:t xml:space="preserve"> students graduated, the year's class.</w:t>
+      </w:r>
+    </w:p>
+    <w:p>
+      <w:pPr>
+        <w:spacing w:after="120" w:line="320" w:lineRule="auto"/>
+      </w:pPr>
+      <w:r>
+        <w:t xml:space="preserve">Sunday, May 17 was Senior Sunday and Ascension Sunday. The 9:45 AM Senior Recognition moment in the Fellowship Hall opened the morning with a churchwide breakfast. The 11:00 AM service carried the recognition of the year's high-school graduates. The sermon closed the What If Jesus Was Serious? series with "Hearers vs Doers" from Matthew 7:24-29. The sermon used the Mars Climate Orbiter as its opening hook, named the prosperity gospel, Christian </w:t>
+      </w:r>
+      <w:proofErr w:type="spellStart"/>
+      <w:proofErr w:type="gramStart"/>
+      <w:r>
+        <w:t>nationalism,as</w:t>
+      </w:r>
+      <w:proofErr w:type="spellEnd"/>
+      <w:proofErr w:type="gramEnd"/>
+      <w:r>
+        <w:t xml:space="preserve"> counterfeit theologies a congregation needs to be able to recognize, and named four warning signs of counterfeit faith in any tradition.</w:t>
       </w:r>
     </w:p>
     <w:p>
@@ -2662,7 +3250,7 @@
 </file>
 
 <file path=word/endnotes.xml><?xml version="1.0" encoding="utf-8"?>
-<w:endnotes xmlns:wpc="http://schemas.microsoft.com/office/word/2010/wordprocessingCanvas" xmlns:cx="http://schemas.microsoft.com/office/drawing/2014/chartex" xmlns:cx1="http://schemas.microsoft.com/office/drawing/2015/9/8/chartex" xmlns:cx2="http://schemas.microsoft.com/office/drawing/2015/10/21/chartex" xmlns:cx3="http://schemas.microsoft.com/office/drawing/2016/5/9/chartex" xmlns:cx4="http://schemas.microsoft.com/office/drawing/2016/5/10/chartex" xmlns:cx5="http://schemas.microsoft.com/office/drawing/2016/5/11/chartex" xmlns:cx6="http://schemas.microsoft.com/office/drawing/2016/5/12/chartex" xmlns:cx7="http://schemas.microsoft.com/office/drawing/2016/5/13/chartex" xmlns:cx8="http://schemas.microsoft.com/office/drawing/2016/5/14/chartex" xmlns:mc="http://schemas.openxmlformats.org/markup-compatibility/2006" xmlns:aink="http://schemas.microsoft.com/office/drawing/2016/ink" xmlns:am3d="http://schemas.microsoft.com/office/drawing/2017/model3d" xmlns:o="urn:schemas-microsoft-com:office:office" xmlns:oel="http://schemas.microsoft.com/office/2019/extlst" xmlns:r="http://schemas.openxmlformats.org/officeDocument/2006/relationships" xmlns:m="http://schemas.openxmlformats.org/officeDocument/2006/math" xmlns:v="urn:schemas-microsoft-com:vml" xmlns:wp14="http://schemas.microsoft.com/office/word/2010/wordprocessingDrawing" xmlns:wp="http://schemas.openxmlformats.org/drawingml/2006/wordprocessingDrawing" xmlns:w10="urn:schemas-microsoft-com:office:word" xmlns:w="http://schemas.openxmlformats.org/wordprocessingml/2006/main" xmlns:w14="http://schemas.microsoft.com/office/word/2010/wordml" xmlns:w15="http://schemas.microsoft.com/office/word/2012/wordml" xmlns:w16cex="http://schemas.microsoft.com/office/word/2018/wordml/cex" xmlns:w16cid="http://schemas.microsoft.com/office/word/2016/wordml/cid" xmlns:w16="http://schemas.microsoft.com/office/word/2018/wordml" xmlns:w16du="http://schemas.microsoft.com/office/word/2023/wordml/word16du" xmlns:w16sdtdh="http://schemas.microsoft.com/office/word/2020/wordml/sdtdatahash" xmlns:w16sdtfl="http://schemas.microsoft.com/office/word/2024/wordml/sdtformatlock" xmlns:w16se="http://schemas.microsoft.com/office/word/2015/wordml/symex" xmlns:wpg="http://schemas.microsoft.com/office/word/2010/wordprocessingGroup" xmlns:wpi="http://schemas.microsoft.com/office/word/2010/wordprocessingInk" xmlns:wne="http://schemas.microsoft.com/office/word/2006/wordml" xmlns:wps="http://schemas.microsoft.com/office/word/2010/wordprocessingShape" mc:Ignorable="w14 w15 w16se w16cid w16 w16cex w16sdtdh w16sdtfl w16du wp14">
+<w:endnotes xmlns:wpc="http://schemas.microsoft.com/office/word/2010/wordprocessingCanvas" xmlns:cx="http://schemas.microsoft.com/office/drawing/2014/chartex" xmlns:cx1="http://schemas.microsoft.com/office/drawing/2015/9/8/chartex" xmlns:cx2="http://schemas.microsoft.com/office/drawing/2015/10/21/chartex" xmlns:cx3="http://schemas.microsoft.com/office/drawing/2016/5/9/chartex" xmlns:cx4="http://schemas.microsoft.com/office/drawing/2016/5/10/chartex" xmlns:cx5="http://schemas.microsoft.com/office/drawing/2016/5/11/chartex" xmlns:cx6="http://schemas.microsoft.com/office/drawing/2016/5/12/chartex" xmlns:cx7="http://schemas.microsoft.com/office/drawing/2016/5/13/chartex" xmlns:cx8="http://schemas.microsoft.com/office/drawing/2016/5/14/chartex" xmlns:mc="http://schemas.openxmlformats.org/markup-compatibility/2006" xmlns:m="http://schemas.openxmlformats.org/officeDocument/2006/math" xmlns:aink="http://schemas.microsoft.com/office/drawing/2016/ink" xmlns:am3d="http://schemas.microsoft.com/office/drawing/2017/model3d" xmlns:oel="http://schemas.microsoft.com/office/2019/extlst" xmlns:r="http://schemas.openxmlformats.org/officeDocument/2006/relationships" xmlns:wp14="http://schemas.microsoft.com/office/word/2010/wordprocessingDrawing" xmlns:wp="http://schemas.openxmlformats.org/drawingml/2006/wordprocessingDrawing" xmlns:wpg="http://schemas.microsoft.com/office/word/2010/wordprocessingGroup" xmlns:wpi="http://schemas.microsoft.com/office/word/2010/wordprocessingInk" xmlns:wps="http://schemas.microsoft.com/office/word/2010/wordprocessingShape" xmlns:o="urn:schemas-microsoft-com:office:office" xmlns:v="urn:schemas-microsoft-com:vml" xmlns:w10="urn:schemas-microsoft-com:office:word" xmlns:w="http://schemas.openxmlformats.org/wordprocessingml/2006/main" xmlns:w14="http://schemas.microsoft.com/office/word/2010/wordml" xmlns:w15="http://schemas.microsoft.com/office/word/2012/wordml" xmlns:w16cei="http://schemas.microsoft.com/office/word/2026/wordml/cei" xmlns:w16cex="http://schemas.microsoft.com/office/word/2018/wordml/cex" xmlns:w16cid="http://schemas.microsoft.com/office/word/2016/wordml/cid" xmlns:w16="http://schemas.microsoft.com/office/word/2018/wordml" xmlns:w16sdtdh="http://schemas.microsoft.com/office/word/2020/wordml/sdtdatahash" xmlns:w16sdtfl="http://schemas.microsoft.com/office/word/2024/wordml/sdtformatlock" xmlns:w16se="http://schemas.microsoft.com/office/word/2015/wordml/symex" xmlns:w16du="http://schemas.microsoft.com/office/word/2023/wordml/word16du" xmlns:wne="http://schemas.microsoft.com/office/word/2006/wordml" mc:Ignorable="w14 w15 w16se w16cid w16 w16cex w16sdtdh w16sdtfl w16du wp14">
   <w:endnote w:type="separator" w:id="-1">
     <w:p>
       <w:r>
@@ -2681,7 +3269,7 @@
 </file>
 
 <file path=word/footer1.xml><?xml version="1.0" encoding="utf-8"?>
-<w:ftr xmlns:wpc="http://schemas.microsoft.com/office/word/2010/wordprocessingCanvas" xmlns:cx="http://schemas.microsoft.com/office/drawing/2014/chartex" xmlns:cx1="http://schemas.microsoft.com/office/drawing/2015/9/8/chartex" xmlns:cx2="http://schemas.microsoft.com/office/drawing/2015/10/21/chartex" xmlns:cx3="http://schemas.microsoft.com/office/drawing/2016/5/9/chartex" xmlns:cx4="http://schemas.microsoft.com/office/drawing/2016/5/10/chartex" xmlns:cx5="http://schemas.microsoft.com/office/drawing/2016/5/11/chartex" xmlns:cx6="http://schemas.microsoft.com/office/drawing/2016/5/12/chartex" xmlns:cx7="http://schemas.microsoft.com/office/drawing/2016/5/13/chartex" xmlns:cx8="http://schemas.microsoft.com/office/drawing/2016/5/14/chartex" xmlns:mc="http://schemas.openxmlformats.org/markup-compatibility/2006" xmlns:aink="http://schemas.microsoft.com/office/drawing/2016/ink" xmlns:am3d="http://schemas.microsoft.com/office/drawing/2017/model3d" xmlns:o="urn:schemas-microsoft-com:office:office" xmlns:oel="http://schemas.microsoft.com/office/2019/extlst" xmlns:r="http://schemas.openxmlformats.org/officeDocument/2006/relationships" xmlns:m="http://schemas.openxmlformats.org/officeDocument/2006/math" xmlns:v="urn:schemas-microsoft-com:vml" xmlns:wp14="http://schemas.microsoft.com/office/word/2010/wordprocessingDrawing" xmlns:wp="http://schemas.openxmlformats.org/drawingml/2006/wordprocessingDrawing" xmlns:w10="urn:schemas-microsoft-com:office:word" xmlns:w="http://schemas.openxmlformats.org/wordprocessingml/2006/main" xmlns:w14="http://schemas.microsoft.com/office/word/2010/wordml" xmlns:w15="http://schemas.microsoft.com/office/word/2012/wordml" xmlns:w16cex="http://schemas.microsoft.com/office/word/2018/wordml/cex" xmlns:w16cid="http://schemas.microsoft.com/office/word/2016/wordml/cid" xmlns:w16="http://schemas.microsoft.com/office/word/2018/wordml" xmlns:w16du="http://schemas.microsoft.com/office/word/2023/wordml/word16du" xmlns:w16sdtdh="http://schemas.microsoft.com/office/word/2020/wordml/sdtdatahash" xmlns:w16sdtfl="http://schemas.microsoft.com/office/word/2024/wordml/sdtformatlock" xmlns:w16se="http://schemas.microsoft.com/office/word/2015/wordml/symex" xmlns:wpg="http://schemas.microsoft.com/office/word/2010/wordprocessingGroup" xmlns:wpi="http://schemas.microsoft.com/office/word/2010/wordprocessingInk" xmlns:wne="http://schemas.microsoft.com/office/word/2006/wordml" xmlns:wps="http://schemas.microsoft.com/office/word/2010/wordprocessingShape" mc:Ignorable="w14 w15 w16se w16cid w16 w16cex w16sdtdh w16sdtfl w16du wp14">
+<w:ftr xmlns:wpc="http://schemas.microsoft.com/office/word/2010/wordprocessingCanvas" xmlns:cx="http://schemas.microsoft.com/office/drawing/2014/chartex" xmlns:cx1="http://schemas.microsoft.com/office/drawing/2015/9/8/chartex" xmlns:cx2="http://schemas.microsoft.com/office/drawing/2015/10/21/chartex" xmlns:cx3="http://schemas.microsoft.com/office/drawing/2016/5/9/chartex" xmlns:cx4="http://schemas.microsoft.com/office/drawing/2016/5/10/chartex" xmlns:cx5="http://schemas.microsoft.com/office/drawing/2016/5/11/chartex" xmlns:cx6="http://schemas.microsoft.com/office/drawing/2016/5/12/chartex" xmlns:cx7="http://schemas.microsoft.com/office/drawing/2016/5/13/chartex" xmlns:cx8="http://schemas.microsoft.com/office/drawing/2016/5/14/chartex" xmlns:mc="http://schemas.openxmlformats.org/markup-compatibility/2006" xmlns:m="http://schemas.openxmlformats.org/officeDocument/2006/math" xmlns:aink="http://schemas.microsoft.com/office/drawing/2016/ink" xmlns:am3d="http://schemas.microsoft.com/office/drawing/2017/model3d" xmlns:oel="http://schemas.microsoft.com/office/2019/extlst" xmlns:r="http://schemas.openxmlformats.org/officeDocument/2006/relationships" xmlns:wp14="http://schemas.microsoft.com/office/word/2010/wordprocessingDrawing" xmlns:wp="http://schemas.openxmlformats.org/drawingml/2006/wordprocessingDrawing" xmlns:wpg="http://schemas.microsoft.com/office/word/2010/wordprocessingGroup" xmlns:wpi="http://schemas.microsoft.com/office/word/2010/wordprocessingInk" xmlns:wps="http://schemas.microsoft.com/office/word/2010/wordprocessingShape" xmlns:o="urn:schemas-microsoft-com:office:office" xmlns:v="urn:schemas-microsoft-com:vml" xmlns:w10="urn:schemas-microsoft-com:office:word" xmlns:w="http://schemas.openxmlformats.org/wordprocessingml/2006/main" xmlns:w14="http://schemas.microsoft.com/office/word/2010/wordml" xmlns:w15="http://schemas.microsoft.com/office/word/2012/wordml" xmlns:w16cei="http://schemas.microsoft.com/office/word/2026/wordml/cei" xmlns:w16cex="http://schemas.microsoft.com/office/word/2018/wordml/cex" xmlns:w16cid="http://schemas.microsoft.com/office/word/2016/wordml/cid" xmlns:w16="http://schemas.microsoft.com/office/word/2018/wordml" xmlns:w16sdtdh="http://schemas.microsoft.com/office/word/2020/wordml/sdtdatahash" xmlns:w16sdtfl="http://schemas.microsoft.com/office/word/2024/wordml/sdtformatlock" xmlns:w16se="http://schemas.microsoft.com/office/word/2015/wordml/symex" xmlns:w16du="http://schemas.microsoft.com/office/word/2023/wordml/word16du" xmlns:wne="http://schemas.microsoft.com/office/word/2006/wordml" mc:Ignorable="w14 w15 w16se w16cid w16 w16cex w16sdtdh w16sdtfl w16du wp14">
   <w:p>
     <w:pPr>
       <w:jc w:val="center"/>
@@ -2732,7 +3320,7 @@
 </file>
 
 <file path=word/footnotes.xml><?xml version="1.0" encoding="utf-8"?>
-<w:footnotes xmlns:wpc="http://schemas.microsoft.com/office/word/2010/wordprocessingCanvas" xmlns:cx="http://schemas.microsoft.com/office/drawing/2014/chartex" xmlns:cx1="http://schemas.microsoft.com/office/drawing/2015/9/8/chartex" xmlns:cx2="http://schemas.microsoft.com/office/drawing/2015/10/21/chartex" xmlns:cx3="http://schemas.microsoft.com/office/drawing/2016/5/9/chartex" xmlns:cx4="http://schemas.microsoft.com/office/drawing/2016/5/10/chartex" xmlns:cx5="http://schemas.microsoft.com/office/drawing/2016/5/11/chartex" xmlns:cx6="http://schemas.microsoft.com/office/drawing/2016/5/12/chartex" xmlns:cx7="http://schemas.microsoft.com/office/drawing/2016/5/13/chartex" xmlns:cx8="http://schemas.microsoft.com/office/drawing/2016/5/14/chartex" xmlns:mc="http://schemas.openxmlformats.org/markup-compatibility/2006" xmlns:aink="http://schemas.microsoft.com/office/drawing/2016/ink" xmlns:am3d="http://schemas.microsoft.com/office/drawing/2017/model3d" xmlns:o="urn:schemas-microsoft-com:office:office" xmlns:oel="http://schemas.microsoft.com/office/2019/extlst" xmlns:r="http://schemas.openxmlformats.org/officeDocument/2006/relationships" xmlns:m="http://schemas.openxmlformats.org/officeDocument/2006/math" xmlns:v="urn:schemas-microsoft-com:vml" xmlns:wp14="http://schemas.microsoft.com/office/word/2010/wordprocessingDrawing" xmlns:wp="http://schemas.openxmlformats.org/drawingml/2006/wordprocessingDrawing" xmlns:w10="urn:schemas-microsoft-com:office:word" xmlns:w="http://schemas.openxmlformats.org/wordprocessingml/2006/main" xmlns:w14="http://schemas.microsoft.com/office/word/2010/wordml" xmlns:w15="http://schemas.microsoft.com/office/word/2012/wordml" xmlns:w16cex="http://schemas.microsoft.com/office/word/2018/wordml/cex" xmlns:w16cid="http://schemas.microsoft.com/office/word/2016/wordml/cid" xmlns:w16="http://schemas.microsoft.com/office/word/2018/wordml" xmlns:w16du="http://schemas.microsoft.com/office/word/2023/wordml/word16du" xmlns:w16sdtdh="http://schemas.microsoft.com/office/word/2020/wordml/sdtdatahash" xmlns:w16sdtfl="http://schemas.microsoft.com/office/word/2024/wordml/sdtformatlock" xmlns:w16se="http://schemas.microsoft.com/office/word/2015/wordml/symex" xmlns:wpg="http://schemas.microsoft.com/office/word/2010/wordprocessingGroup" xmlns:wpi="http://schemas.microsoft.com/office/word/2010/wordprocessingInk" xmlns:wne="http://schemas.microsoft.com/office/word/2006/wordml" xmlns:wps="http://schemas.microsoft.com/office/word/2010/wordprocessingShape" mc:Ignorable="w14 w15 w16se w16cid w16 w16cex w16sdtdh w16sdtfl w16du wp14">
+<w:footnotes xmlns:wpc="http://schemas.microsoft.com/office/word/2010/wordprocessingCanvas" xmlns:cx="http://schemas.microsoft.com/office/drawing/2014/chartex" xmlns:cx1="http://schemas.microsoft.com/office/drawing/2015/9/8/chartex" xmlns:cx2="http://schemas.microsoft.com/office/drawing/2015/10/21/chartex" xmlns:cx3="http://schemas.microsoft.com/office/drawing/2016/5/9/chartex" xmlns:cx4="http://schemas.microsoft.com/office/drawing/2016/5/10/chartex" xmlns:cx5="http://schemas.microsoft.com/office/drawing/2016/5/11/chartex" xmlns:cx6="http://schemas.microsoft.com/office/drawing/2016/5/12/chartex" xmlns:cx7="http://schemas.microsoft.com/office/drawing/2016/5/13/chartex" xmlns:cx8="http://schemas.microsoft.com/office/drawing/2016/5/14/chartex" xmlns:mc="http://schemas.openxmlformats.org/markup-compatibility/2006" xmlns:m="http://schemas.openxmlformats.org/officeDocument/2006/math" xmlns:aink="http://schemas.microsoft.com/office/drawing/2016/ink" xmlns:am3d="http://schemas.microsoft.com/office/drawing/2017/model3d" xmlns:oel="http://schemas.microsoft.com/office/2019/extlst" xmlns:r="http://schemas.openxmlformats.org/officeDocument/2006/relationships" xmlns:wp14="http://schemas.microsoft.com/office/word/2010/wordprocessingDrawing" xmlns:wp="http://schemas.openxmlformats.org/drawingml/2006/wordprocessingDrawing" xmlns:wpg="http://schemas.microsoft.com/office/word/2010/wordprocessingGroup" xmlns:wpi="http://schemas.microsoft.com/office/word/2010/wordprocessingInk" xmlns:wps="http://schemas.microsoft.com/office/word/2010/wordprocessingShape" xmlns:o="urn:schemas-microsoft-com:office:office" xmlns:v="urn:schemas-microsoft-com:vml" xmlns:w10="urn:schemas-microsoft-com:office:word" xmlns:w="http://schemas.openxmlformats.org/wordprocessingml/2006/main" xmlns:w14="http://schemas.microsoft.com/office/word/2010/wordml" xmlns:w15="http://schemas.microsoft.com/office/word/2012/wordml" xmlns:w16cei="http://schemas.microsoft.com/office/word/2026/wordml/cei" xmlns:w16cex="http://schemas.microsoft.com/office/word/2018/wordml/cex" xmlns:w16cid="http://schemas.microsoft.com/office/word/2016/wordml/cid" xmlns:w16="http://schemas.microsoft.com/office/word/2018/wordml" xmlns:w16sdtdh="http://schemas.microsoft.com/office/word/2020/wordml/sdtdatahash" xmlns:w16sdtfl="http://schemas.microsoft.com/office/word/2024/wordml/sdtformatlock" xmlns:w16se="http://schemas.microsoft.com/office/word/2015/wordml/symex" xmlns:w16du="http://schemas.microsoft.com/office/word/2023/wordml/word16du" xmlns:wne="http://schemas.microsoft.com/office/word/2006/wordml" mc:Ignorable="w14 w15 w16se w16cid w16 w16cex w16sdtdh w16sdtfl w16du wp14">
   <w:footnote w:type="separator" w:id="-1">
     <w:p>
       <w:r>
@@ -2751,7 +3339,7 @@
 </file>
 
 <file path=word/header1.xml><?xml version="1.0" encoding="utf-8"?>
-<w:hdr xmlns:wpc="http://schemas.microsoft.com/office/word/2010/wordprocessingCanvas" xmlns:cx="http://schemas.microsoft.com/office/drawing/2014/chartex" xmlns:cx1="http://schemas.microsoft.com/office/drawing/2015/9/8/chartex" xmlns:cx2="http://schemas.microsoft.com/office/drawing/2015/10/21/chartex" xmlns:cx3="http://schemas.microsoft.com/office/drawing/2016/5/9/chartex" xmlns:cx4="http://schemas.microsoft.com/office/drawing/2016/5/10/chartex" xmlns:cx5="http://schemas.microsoft.com/office/drawing/2016/5/11/chartex" xmlns:cx6="http://schemas.microsoft.com/office/drawing/2016/5/12/chartex" xmlns:cx7="http://schemas.microsoft.com/office/drawing/2016/5/13/chartex" xmlns:cx8="http://schemas.microsoft.com/office/drawing/2016/5/14/chartex" xmlns:mc="http://schemas.openxmlformats.org/markup-compatibility/2006" xmlns:aink="http://schemas.microsoft.com/office/drawing/2016/ink" xmlns:am3d="http://schemas.microsoft.com/office/drawing/2017/model3d" xmlns:o="urn:schemas-microsoft-com:office:office" xmlns:oel="http://schemas.microsoft.com/office/2019/extlst" xmlns:r="http://schemas.openxmlformats.org/officeDocument/2006/relationships" xmlns:m="http://schemas.openxmlformats.org/officeDocument/2006/math" xmlns:v="urn:schemas-microsoft-com:vml" xmlns:wp14="http://schemas.microsoft.com/office/word/2010/wordprocessingDrawing" xmlns:wp="http://schemas.openxmlformats.org/drawingml/2006/wordprocessingDrawing" xmlns:w10="urn:schemas-microsoft-com:office:word" xmlns:w="http://schemas.openxmlformats.org/wordprocessingml/2006/main" xmlns:w14="http://schemas.microsoft.com/office/word/2010/wordml" xmlns:w15="http://schemas.microsoft.com/office/word/2012/wordml" xmlns:w16cex="http://schemas.microsoft.com/office/word/2018/wordml/cex" xmlns:w16cid="http://schemas.microsoft.com/office/word/2016/wordml/cid" xmlns:w16="http://schemas.microsoft.com/office/word/2018/wordml" xmlns:w16du="http://schemas.microsoft.com/office/word/2023/wordml/word16du" xmlns:w16sdtdh="http://schemas.microsoft.com/office/word/2020/wordml/sdtdatahash" xmlns:w16sdtfl="http://schemas.microsoft.com/office/word/2024/wordml/sdtformatlock" xmlns:w16se="http://schemas.microsoft.com/office/word/2015/wordml/symex" xmlns:wpg="http://schemas.microsoft.com/office/word/2010/wordprocessingGroup" xmlns:wpi="http://schemas.microsoft.com/office/word/2010/wordprocessingInk" xmlns:wne="http://schemas.microsoft.com/office/word/2006/wordml" xmlns:wps="http://schemas.microsoft.com/office/word/2010/wordprocessingShape" mc:Ignorable="w14 w15 w16se w16cid w16 w16cex w16sdtdh w16sdtfl w16du wp14">
+<w:hdr xmlns:wpc="http://schemas.microsoft.com/office/word/2010/wordprocessingCanvas" xmlns:cx="http://schemas.microsoft.com/office/drawing/2014/chartex" xmlns:cx1="http://schemas.microsoft.com/office/drawing/2015/9/8/chartex" xmlns:cx2="http://schemas.microsoft.com/office/drawing/2015/10/21/chartex" xmlns:cx3="http://schemas.microsoft.com/office/drawing/2016/5/9/chartex" xmlns:cx4="http://schemas.microsoft.com/office/drawing/2016/5/10/chartex" xmlns:cx5="http://schemas.microsoft.com/office/drawing/2016/5/11/chartex" xmlns:cx6="http://schemas.microsoft.com/office/drawing/2016/5/12/chartex" xmlns:cx7="http://schemas.microsoft.com/office/drawing/2016/5/13/chartex" xmlns:cx8="http://schemas.microsoft.com/office/drawing/2016/5/14/chartex" xmlns:mc="http://schemas.openxmlformats.org/markup-compatibility/2006" xmlns:m="http://schemas.openxmlformats.org/officeDocument/2006/math" xmlns:aink="http://schemas.microsoft.com/office/drawing/2016/ink" xmlns:am3d="http://schemas.microsoft.com/office/drawing/2017/model3d" xmlns:oel="http://schemas.microsoft.com/office/2019/extlst" xmlns:r="http://schemas.openxmlformats.org/officeDocument/2006/relationships" xmlns:wp14="http://schemas.microsoft.com/office/word/2010/wordprocessingDrawing" xmlns:wp="http://schemas.openxmlformats.org/drawingml/2006/wordprocessingDrawing" xmlns:wpg="http://schemas.microsoft.com/office/word/2010/wordprocessingGroup" xmlns:wpi="http://schemas.microsoft.com/office/word/2010/wordprocessingInk" xmlns:wps="http://schemas.microsoft.com/office/word/2010/wordprocessingShape" xmlns:o="urn:schemas-microsoft-com:office:office" xmlns:v="urn:schemas-microsoft-com:vml" xmlns:w10="urn:schemas-microsoft-com:office:word" xmlns:w="http://schemas.openxmlformats.org/wordprocessingml/2006/main" xmlns:w14="http://schemas.microsoft.com/office/word/2010/wordml" xmlns:w15="http://schemas.microsoft.com/office/word/2012/wordml" xmlns:w16cei="http://schemas.microsoft.com/office/word/2026/wordml/cei" xmlns:w16cex="http://schemas.microsoft.com/office/word/2018/wordml/cex" xmlns:w16cid="http://schemas.microsoft.com/office/word/2016/wordml/cid" xmlns:w16="http://schemas.microsoft.com/office/word/2018/wordml" xmlns:w16sdtdh="http://schemas.microsoft.com/office/word/2020/wordml/sdtdatahash" xmlns:w16sdtfl="http://schemas.microsoft.com/office/word/2024/wordml/sdtformatlock" xmlns:w16se="http://schemas.microsoft.com/office/word/2015/wordml/symex" xmlns:w16du="http://schemas.microsoft.com/office/word/2023/wordml/word16du" xmlns:wne="http://schemas.microsoft.com/office/word/2006/wordml" mc:Ignorable="w14 w15 w16se w16cid w16 w16cex w16sdtdh w16sdtfl w16du wp14">
   <w:p>
     <w:pPr>
       <w:jc w:val="center"/>
@@ -2764,14 +3352,36 @@
         <w:sz w:val="18"/>
         <w:szCs w:val="18"/>
       </w:rPr>
-      <w:t>Spanish Fort United Methodist Church  •  A Two-Year Overview</w:t>
+      <w:t xml:space="preserve">Spanish Fort United Methodist </w:t>
+    </w:r>
+    <w:proofErr w:type="gramStart"/>
+    <w:r>
+      <w:rPr>
+        <w:i/>
+        <w:iCs/>
+        <w:color w:val="999999"/>
+        <w:sz w:val="18"/>
+        <w:szCs w:val="18"/>
+      </w:rPr>
+      <w:t>Church  •</w:t>
+    </w:r>
+    <w:proofErr w:type="gramEnd"/>
+    <w:r>
+      <w:rPr>
+        <w:i/>
+        <w:iCs/>
+        <w:color w:val="999999"/>
+        <w:sz w:val="18"/>
+        <w:szCs w:val="18"/>
+      </w:rPr>
+      <w:t xml:space="preserve">  A Two-Year Overview</w:t>
     </w:r>
   </w:p>
 </w:hdr>
 </file>
 
 <file path=word/numbering.xml><?xml version="1.0" encoding="utf-8"?>
-<w:numbering xmlns:wpc="http://schemas.microsoft.com/office/word/2010/wordprocessingCanvas" xmlns:cx="http://schemas.microsoft.com/office/drawing/2014/chartex" xmlns:cx1="http://schemas.microsoft.com/office/drawing/2015/9/8/chartex" xmlns:cx2="http://schemas.microsoft.com/office/drawing/2015/10/21/chartex" xmlns:cx3="http://schemas.microsoft.com/office/drawing/2016/5/9/chartex" xmlns:cx4="http://schemas.microsoft.com/office/drawing/2016/5/10/chartex" xmlns:cx5="http://schemas.microsoft.com/office/drawing/2016/5/11/chartex" xmlns:cx6="http://schemas.microsoft.com/office/drawing/2016/5/12/chartex" xmlns:cx7="http://schemas.microsoft.com/office/drawing/2016/5/13/chartex" xmlns:cx8="http://schemas.microsoft.com/office/drawing/2016/5/14/chartex" xmlns:mc="http://schemas.openxmlformats.org/markup-compatibility/2006" xmlns:aink="http://schemas.microsoft.com/office/drawing/2016/ink" xmlns:am3d="http://schemas.microsoft.com/office/drawing/2017/model3d" xmlns:o="urn:schemas-microsoft-com:office:office" xmlns:oel="http://schemas.microsoft.com/office/2019/extlst" xmlns:r="http://schemas.openxmlformats.org/officeDocument/2006/relationships" xmlns:m="http://schemas.openxmlformats.org/officeDocument/2006/math" xmlns:v="urn:schemas-microsoft-com:vml" xmlns:wp14="http://schemas.microsoft.com/office/word/2010/wordprocessingDrawing" xmlns:wp="http://schemas.openxmlformats.org/drawingml/2006/wordprocessingDrawing" xmlns:w10="urn:schemas-microsoft-com:office:word" xmlns:w="http://schemas.openxmlformats.org/wordprocessingml/2006/main" xmlns:w14="http://schemas.microsoft.com/office/word/2010/wordml" xmlns:w15="http://schemas.microsoft.com/office/word/2012/wordml" xmlns:w16cex="http://schemas.microsoft.com/office/word/2018/wordml/cex" xmlns:w16cid="http://schemas.microsoft.com/office/word/2016/wordml/cid" xmlns:w16="http://schemas.microsoft.com/office/word/2018/wordml" xmlns:w16du="http://schemas.microsoft.com/office/word/2023/wordml/word16du" xmlns:w16sdtdh="http://schemas.microsoft.com/office/word/2020/wordml/sdtdatahash" xmlns:w16sdtfl="http://schemas.microsoft.com/office/word/2024/wordml/sdtformatlock" xmlns:w16se="http://schemas.microsoft.com/office/word/2015/wordml/symex" xmlns:wpg="http://schemas.microsoft.com/office/word/2010/wordprocessingGroup" xmlns:wpi="http://schemas.microsoft.com/office/word/2010/wordprocessingInk" xmlns:wne="http://schemas.microsoft.com/office/word/2006/wordml" xmlns:wps="http://schemas.microsoft.com/office/word/2010/wordprocessingShape" mc:Ignorable="w14 w15 w16se w16cid w16 w16cex w16sdtdh w16sdtfl w16du wp14">
+<w:numbering xmlns:wpc="http://schemas.microsoft.com/office/word/2010/wordprocessingCanvas" xmlns:cx="http://schemas.microsoft.com/office/drawing/2014/chartex" xmlns:cx1="http://schemas.microsoft.com/office/drawing/2015/9/8/chartex" xmlns:cx2="http://schemas.microsoft.com/office/drawing/2015/10/21/chartex" xmlns:cx3="http://schemas.microsoft.com/office/drawing/2016/5/9/chartex" xmlns:cx4="http://schemas.microsoft.com/office/drawing/2016/5/10/chartex" xmlns:cx5="http://schemas.microsoft.com/office/drawing/2016/5/11/chartex" xmlns:cx6="http://schemas.microsoft.com/office/drawing/2016/5/12/chartex" xmlns:cx7="http://schemas.microsoft.com/office/drawing/2016/5/13/chartex" xmlns:cx8="http://schemas.microsoft.com/office/drawing/2016/5/14/chartex" xmlns:mc="http://schemas.openxmlformats.org/markup-compatibility/2006" xmlns:m="http://schemas.openxmlformats.org/officeDocument/2006/math" xmlns:aink="http://schemas.microsoft.com/office/drawing/2016/ink" xmlns:am3d="http://schemas.microsoft.com/office/drawing/2017/model3d" xmlns:oel="http://schemas.microsoft.com/office/2019/extlst" xmlns:r="http://schemas.openxmlformats.org/officeDocument/2006/relationships" xmlns:wp14="http://schemas.microsoft.com/office/word/2010/wordprocessingDrawing" xmlns:wp="http://schemas.openxmlformats.org/drawingml/2006/wordprocessingDrawing" xmlns:wpg="http://schemas.microsoft.com/office/word/2010/wordprocessingGroup" xmlns:wpi="http://schemas.microsoft.com/office/word/2010/wordprocessingInk" xmlns:wps="http://schemas.microsoft.com/office/word/2010/wordprocessingShape" xmlns:o="urn:schemas-microsoft-com:office:office" xmlns:v="urn:schemas-microsoft-com:vml" xmlns:w10="urn:schemas-microsoft-com:office:word" xmlns:w="http://schemas.openxmlformats.org/wordprocessingml/2006/main" xmlns:w14="http://schemas.microsoft.com/office/word/2010/wordml" xmlns:w15="http://schemas.microsoft.com/office/word/2012/wordml" xmlns:w16cei="http://schemas.microsoft.com/office/word/2026/wordml/cei" xmlns:w16cex="http://schemas.microsoft.com/office/word/2018/wordml/cex" xmlns:w16cid="http://schemas.microsoft.com/office/word/2016/wordml/cid" xmlns:w16="http://schemas.microsoft.com/office/word/2018/wordml" xmlns:w16sdtdh="http://schemas.microsoft.com/office/word/2020/wordml/sdtdatahash" xmlns:w16sdtfl="http://schemas.microsoft.com/office/word/2024/wordml/sdtformatlock" xmlns:w16se="http://schemas.microsoft.com/office/word/2015/wordml/symex" xmlns:w16du="http://schemas.microsoft.com/office/word/2023/wordml/word16du" xmlns:wne="http://schemas.microsoft.com/office/word/2006/wordml" mc:Ignorable="w14 w15 w16se w16cid w16 w16cex w16sdtdh w16sdtfl w16du wp14">
   <w:abstractNum w:abstractNumId="0" w15:restartNumberingAfterBreak="0">
     <w:nsid w:val="66006058"/>
     <w:multiLevelType w:val="hybridMultilevel"/>
@@ -2868,7 +3478,7 @@
 </file>
 
 <file path=word/styles.xml><?xml version="1.0" encoding="utf-8"?>
-<w:styles xmlns:mc="http://schemas.openxmlformats.org/markup-compatibility/2006" xmlns:r="http://schemas.openxmlformats.org/officeDocument/2006/relationships" xmlns:w="http://schemas.openxmlformats.org/wordprocessingml/2006/main" xmlns:w14="http://schemas.microsoft.com/office/word/2010/wordml" xmlns:w15="http://schemas.microsoft.com/office/word/2012/wordml" xmlns:w16cex="http://schemas.microsoft.com/office/word/2018/wordml/cex" xmlns:w16cid="http://schemas.microsoft.com/office/word/2016/wordml/cid" xmlns:w16="http://schemas.microsoft.com/office/word/2018/wordml" xmlns:w16du="http://schemas.microsoft.com/office/word/2023/wordml/word16du" xmlns:w16sdtdh="http://schemas.microsoft.com/office/word/2020/wordml/sdtdatahash" xmlns:w16sdtfl="http://schemas.microsoft.com/office/word/2024/wordml/sdtformatlock" xmlns:w16se="http://schemas.microsoft.com/office/word/2015/wordml/symex" mc:Ignorable="w14 w15 w16se w16cid w16 w16cex w16sdtdh w16sdtfl w16du">
+<w:styles xmlns:mc="http://schemas.openxmlformats.org/markup-compatibility/2006" xmlns:r="http://schemas.openxmlformats.org/officeDocument/2006/relationships" xmlns:w="http://schemas.openxmlformats.org/wordprocessingml/2006/main" xmlns:w14="http://schemas.microsoft.com/office/word/2010/wordml" xmlns:w15="http://schemas.microsoft.com/office/word/2012/wordml" xmlns:w16cex="http://schemas.microsoft.com/office/word/2018/wordml/cex" xmlns:w16cid="http://schemas.microsoft.com/office/word/2016/wordml/cid" xmlns:w16="http://schemas.microsoft.com/office/word/2018/wordml" xmlns:w16sdtdh="http://schemas.microsoft.com/office/word/2020/wordml/sdtdatahash" xmlns:w16sdtfl="http://schemas.microsoft.com/office/word/2024/wordml/sdtformatlock" xmlns:w16se="http://schemas.microsoft.com/office/word/2015/wordml/symex" xmlns:w16du="http://schemas.microsoft.com/office/word/2023/wordml/word16du" mc:Ignorable="w14 w15 w16se w16cid w16 w16cex w16sdtdh w16sdtfl w16du">
   <w:docDefaults>
     <w:rPrDefault>
       <w:rPr>

</xml_diff>